<commit_message>
Fix XRSound config and manual issues from review
Fix sound config and manual issues from review:

* Correct the DG and DG-S radiator, nosecone and ladder animation IDs.
* Swap the Shuttle-A gear up/down callouts.
* Add the Shuttle-A inner airlock sound.
* Show "XRSound 4.0 for Orbiter 2024" in the Modules tab, with the
  version taken from the build.
* Manual: drop the dated XRSound 3.0 sentence and left-align the text.

Co-Authored-By: Claude Opus 5.5 <noreply@anthropic.com>
</commit_message>
<xml_diff>
--- a/Sound/XRSound/assets/Doc/XRSound User Manual.docx
+++ b/Sound/XRSound/assets/Doc/XRSound User Manual.docx
@@ -91,6 +91,7 @@
         <w:t xml:space="preserve">Powered by the </w:t>
       </w:r>
       <w:hyperlink r:id="rId9" w:history="1">
+        <w:proofErr w:type="spellStart"/>
         <w:r>
           <w:rPr>
             <w:rStyle w:val="Hyperlink"/>
@@ -98,6 +99,7 @@
           </w:rPr>
           <w:t>miniaudio</w:t>
         </w:r>
+        <w:proofErr w:type="spellEnd"/>
       </w:hyperlink>
       <w:r>
         <w:rPr>
@@ -286,11 +288,10 @@
       <w:pPr>
         <w:pStyle w:val="TOC1"/>
         <w:rPr>
-          <w:rFonts w:asciiTheme="minorHAnsi" w:eastAsiaTheme="minorEastAsia" w:hAnsiTheme="minorHAnsi" w:cstheme="minorBidi"/>
+          <w:rFonts w:ascii="Calibri" w:eastAsia="Yu Mincho" w:hAnsi="Calibri"/>
           <w:noProof/>
           <w:kern w:val="2"/>
           <w:sz w:val="24"/>
-          <w14:ligatures w14:val="standardContextual"/>
         </w:rPr>
       </w:pPr>
       <w:r>
@@ -373,11 +374,10 @@
       <w:pPr>
         <w:pStyle w:val="TOC1"/>
         <w:rPr>
-          <w:rFonts w:asciiTheme="minorHAnsi" w:eastAsiaTheme="minorEastAsia" w:hAnsiTheme="minorHAnsi" w:cstheme="minorBidi"/>
+          <w:rFonts w:ascii="Calibri" w:eastAsia="Yu Mincho" w:hAnsi="Calibri"/>
           <w:noProof/>
           <w:kern w:val="2"/>
           <w:sz w:val="24"/>
-          <w14:ligatures w14:val="standardContextual"/>
         </w:rPr>
       </w:pPr>
       <w:hyperlink w:anchor="_Toc243946900" w:history="1">
@@ -442,11 +442,10 @@
       <w:pPr>
         <w:pStyle w:val="TOC1"/>
         <w:rPr>
-          <w:rFonts w:asciiTheme="minorHAnsi" w:eastAsiaTheme="minorEastAsia" w:hAnsiTheme="minorHAnsi" w:cstheme="minorBidi"/>
+          <w:rFonts w:ascii="Calibri" w:eastAsia="Yu Mincho" w:hAnsi="Calibri"/>
           <w:noProof/>
           <w:kern w:val="2"/>
           <w:sz w:val="24"/>
-          <w14:ligatures w14:val="standardContextual"/>
         </w:rPr>
       </w:pPr>
       <w:hyperlink w:anchor="_Toc243946901" w:history="1">
@@ -511,11 +510,10 @@
       <w:pPr>
         <w:pStyle w:val="TOC1"/>
         <w:rPr>
-          <w:rFonts w:asciiTheme="minorHAnsi" w:eastAsiaTheme="minorEastAsia" w:hAnsiTheme="minorHAnsi" w:cstheme="minorBidi"/>
+          <w:rFonts w:ascii="Calibri" w:eastAsia="Yu Mincho" w:hAnsi="Calibri"/>
           <w:noProof/>
           <w:kern w:val="2"/>
           <w:sz w:val="24"/>
-          <w14:ligatures w14:val="standardContextual"/>
         </w:rPr>
       </w:pPr>
       <w:hyperlink w:anchor="_Toc243946902" w:history="1">
@@ -580,11 +578,10 @@
       <w:pPr>
         <w:pStyle w:val="TOC1"/>
         <w:rPr>
-          <w:rFonts w:asciiTheme="minorHAnsi" w:eastAsiaTheme="minorEastAsia" w:hAnsiTheme="minorHAnsi" w:cstheme="minorBidi"/>
+          <w:rFonts w:ascii="Calibri" w:eastAsia="Yu Mincho" w:hAnsi="Calibri"/>
           <w:noProof/>
           <w:kern w:val="2"/>
           <w:sz w:val="24"/>
-          <w14:ligatures w14:val="standardContextual"/>
         </w:rPr>
       </w:pPr>
       <w:hyperlink w:anchor="_Toc243946903" w:history="1">
@@ -649,11 +646,10 @@
       <w:pPr>
         <w:pStyle w:val="TOC1"/>
         <w:rPr>
-          <w:rFonts w:asciiTheme="minorHAnsi" w:eastAsiaTheme="minorEastAsia" w:hAnsiTheme="minorHAnsi" w:cstheme="minorBidi"/>
+          <w:rFonts w:ascii="Calibri" w:eastAsia="Yu Mincho" w:hAnsi="Calibri"/>
           <w:noProof/>
           <w:kern w:val="2"/>
           <w:sz w:val="24"/>
-          <w14:ligatures w14:val="standardContextual"/>
         </w:rPr>
       </w:pPr>
       <w:hyperlink w:anchor="_Toc243946904" w:history="1">
@@ -718,11 +714,10 @@
       <w:pPr>
         <w:pStyle w:val="TOC1"/>
         <w:rPr>
-          <w:rFonts w:asciiTheme="minorHAnsi" w:eastAsiaTheme="minorEastAsia" w:hAnsiTheme="minorHAnsi" w:cstheme="minorBidi"/>
+          <w:rFonts w:ascii="Calibri" w:eastAsia="Yu Mincho" w:hAnsi="Calibri"/>
           <w:noProof/>
           <w:kern w:val="2"/>
           <w:sz w:val="24"/>
-          <w14:ligatures w14:val="standardContextual"/>
         </w:rPr>
       </w:pPr>
       <w:hyperlink w:anchor="_Toc243946905" w:history="1">
@@ -787,11 +782,10 @@
       <w:pPr>
         <w:pStyle w:val="TOC1"/>
         <w:rPr>
-          <w:rFonts w:asciiTheme="minorHAnsi" w:eastAsiaTheme="minorEastAsia" w:hAnsiTheme="minorHAnsi" w:cstheme="minorBidi"/>
+          <w:rFonts w:ascii="Calibri" w:eastAsia="Yu Mincho" w:hAnsi="Calibri"/>
           <w:noProof/>
           <w:kern w:val="2"/>
           <w:sz w:val="24"/>
-          <w14:ligatures w14:val="standardContextual"/>
         </w:rPr>
       </w:pPr>
       <w:hyperlink w:anchor="_Toc243946906" w:history="1">
@@ -856,11 +850,10 @@
       <w:pPr>
         <w:pStyle w:val="TOC1"/>
         <w:rPr>
-          <w:rFonts w:asciiTheme="minorHAnsi" w:eastAsiaTheme="minorEastAsia" w:hAnsiTheme="minorHAnsi" w:cstheme="minorBidi"/>
+          <w:rFonts w:ascii="Calibri" w:eastAsia="Yu Mincho" w:hAnsi="Calibri"/>
           <w:noProof/>
           <w:kern w:val="2"/>
           <w:sz w:val="24"/>
-          <w14:ligatures w14:val="standardContextual"/>
         </w:rPr>
       </w:pPr>
       <w:hyperlink w:anchor="_Toc243946907" w:history="1">
@@ -1001,15 +994,12 @@
       </w:r>
       <w:bookmarkStart w:id="0" w:name="_Toc243946899"/>
       <w:r>
+        <w:lastRenderedPageBreak/>
         <w:t>Copyright</w:t>
       </w:r>
       <w:bookmarkEnd w:id="0"/>
     </w:p>
-    <w:p>
-      <w:pPr>
-        <w:jc w:val="both"/>
-      </w:pPr>
-    </w:p>
+    <w:p/>
     <w:p>
       <w:pPr>
         <w:rPr>
@@ -1244,14 +1234,112 @@
         <w:rPr>
           <w:lang w:eastAsia="ja-JP"/>
         </w:rPr>
-        <w:t>XRSound 4.0 includes the miniaudio library by David Reid and the stb_vorbis Ogg Vorbis decoder by Sean Barrett. Each is offered under a choice of public domain or a permissive license (MIT No Attribution for miniaudio, MIT for stb_vorbis); see the license notices at the end of miniaudio.h and stb_vorbis.c in the XRSound source.</w:t>
+        <w:lastRenderedPageBreak/>
+        <w:t xml:space="preserve">XRSound 4.0 includes the </w:t>
+      </w:r>
+      <w:proofErr w:type="spellStart"/>
+      <w:r>
+        <w:rPr>
+          <w:lang w:eastAsia="ja-JP"/>
+        </w:rPr>
+        <w:t>miniaudio</w:t>
+      </w:r>
+      <w:proofErr w:type="spellEnd"/>
+      <w:r>
+        <w:rPr>
+          <w:lang w:eastAsia="ja-JP"/>
+        </w:rPr>
+        <w:t xml:space="preserve"> library by David Reid and the </w:t>
+      </w:r>
+      <w:proofErr w:type="spellStart"/>
+      <w:r>
+        <w:rPr>
+          <w:lang w:eastAsia="ja-JP"/>
+        </w:rPr>
+        <w:t>stb_vorbis</w:t>
+      </w:r>
+      <w:proofErr w:type="spellEnd"/>
+      <w:r>
+        <w:rPr>
+          <w:lang w:eastAsia="ja-JP"/>
+        </w:rPr>
+        <w:t xml:space="preserve"> Ogg </w:t>
+      </w:r>
+      <w:proofErr w:type="spellStart"/>
+      <w:r>
+        <w:rPr>
+          <w:lang w:eastAsia="ja-JP"/>
+        </w:rPr>
+        <w:t>Vorbis</w:t>
+      </w:r>
+      <w:proofErr w:type="spellEnd"/>
+      <w:r>
+        <w:rPr>
+          <w:lang w:eastAsia="ja-JP"/>
+        </w:rPr>
+        <w:t xml:space="preserve"> decoder by Sean Barrett. Each is offered under a choice of public domain or a permissive license (MIT No Attribution for </w:t>
+      </w:r>
+      <w:proofErr w:type="spellStart"/>
+      <w:r>
+        <w:rPr>
+          <w:lang w:eastAsia="ja-JP"/>
+        </w:rPr>
+        <w:t>miniaudio</w:t>
+      </w:r>
+      <w:proofErr w:type="spellEnd"/>
+      <w:r>
+        <w:rPr>
+          <w:lang w:eastAsia="ja-JP"/>
+        </w:rPr>
+        <w:t xml:space="preserve">, MIT for </w:t>
+      </w:r>
+      <w:proofErr w:type="spellStart"/>
+      <w:r>
+        <w:rPr>
+          <w:lang w:eastAsia="ja-JP"/>
+        </w:rPr>
+        <w:t>stb_vorbis</w:t>
+      </w:r>
+      <w:proofErr w:type="spellEnd"/>
+      <w:r>
+        <w:rPr>
+          <w:lang w:eastAsia="ja-JP"/>
+        </w:rPr>
+        <w:t xml:space="preserve">); see the license notices at the end of </w:t>
+      </w:r>
+      <w:proofErr w:type="spellStart"/>
+      <w:r>
+        <w:rPr>
+          <w:lang w:eastAsia="ja-JP"/>
+        </w:rPr>
+        <w:t>miniaudio.h</w:t>
+      </w:r>
+      <w:proofErr w:type="spellEnd"/>
+      <w:r>
+        <w:rPr>
+          <w:lang w:eastAsia="ja-JP"/>
+        </w:rPr>
+        <w:t xml:space="preserve"> and </w:t>
+      </w:r>
+      <w:proofErr w:type="spellStart"/>
+      <w:r>
+        <w:rPr>
+          <w:lang w:eastAsia="ja-JP"/>
+        </w:rPr>
+        <w:t>stb_vorbis.c</w:t>
+      </w:r>
+      <w:proofErr w:type="spellEnd"/>
+      <w:r>
+        <w:rPr>
+          <w:lang w:eastAsia="ja-JP"/>
+        </w:rPr>
+        <w:t xml:space="preserve"> in the XRSound source.</w:t>
       </w:r>
     </w:p>
     <w:p/>
     <w:p>
       <w:pPr>
         <w:pStyle w:val="Heading1"/>
-        <w:jc w:val="both"/>
       </w:pPr>
       <w:bookmarkStart w:id="1" w:name="_Toc243946900"/>
       <w:r>
@@ -1259,11 +1347,7 @@
       </w:r>
       <w:bookmarkEnd w:id="1"/>
     </w:p>
-    <w:p>
-      <w:pPr>
-        <w:jc w:val="both"/>
-      </w:pPr>
-    </w:p>
+    <w:p/>
     <w:p>
       <w:r>
         <w:t xml:space="preserve">XRSound provides over 450 fully configurable, default sounds and voice callouts for all Orbiter vessels.  In addition, it provides a C++ API for add-on Orbiter vessel and plugin authors to use via the XRSound.dll Orbiter plugin module. </w:t>
@@ -1287,8 +1371,16 @@
         <w:rPr>
           <w:rFonts w:ascii="Courier New" w:hAnsi="Courier New" w:cs="Courier New"/>
         </w:rPr>
-        <w:t>XRSound-DeltaGlider.cfg</w:t>
-      </w:r>
+        <w:t>XRSound-</w:t>
+      </w:r>
+      <w:proofErr w:type="spellStart"/>
+      <w:r>
+        <w:rPr>
+          <w:rFonts w:ascii="Courier New" w:hAnsi="Courier New" w:cs="Courier New"/>
+        </w:rPr>
+        <w:t>DeltaGlider.cfg</w:t>
+      </w:r>
+      <w:proofErr w:type="spellEnd"/>
       <w:r>
         <w:t>, etc., that assign default sounds to vessel-specific animations and events without requiring recompiling the vessel or doing any coding.</w:t>
       </w:r>
@@ -1302,49 +1394,46 @@
       <w:r>
         <w:t>Special thanks to Grzegorz Lorens (</w:t>
       </w:r>
-      <w:hyperlink r:id="rId18" w:history="1">
-        <w:r>
-          <w:rPr>
-            <w:rStyle w:val="Hyperlink"/>
-          </w:rPr>
-          <w:t>Loru</w:t>
-        </w:r>
-      </w:hyperlink>
+      <w:proofErr w:type="spellStart"/>
+      <w:r>
+        <w:fldChar w:fldCharType="begin"/>
+      </w:r>
+      <w:r>
+        <w:instrText>HYPERLINK "https://www.orbiter-forum.com/member.php?u=1580"</w:instrText>
+      </w:r>
+      <w:r>
+        <w:fldChar w:fldCharType="separate"/>
+      </w:r>
+      <w:r>
+        <w:rPr>
+          <w:rStyle w:val="Hyperlink"/>
+        </w:rPr>
+        <w:t>Loru</w:t>
+      </w:r>
+      <w:proofErr w:type="spellEnd"/>
+      <w:r>
+        <w:fldChar w:fldCharType="end"/>
+      </w:r>
       <w:r>
         <w:t xml:space="preserve"> on Orbiter-Forum) for creating the XRSound logo and a brand-new ambient music track that by default plays in external views in space (details below).</w:t>
       </w:r>
     </w:p>
-    <w:p>
-      <w:pPr>
-        <w:jc w:val="both"/>
-      </w:pPr>
-    </w:p>
-    <w:p>
-      <w:pPr>
-        <w:jc w:val="both"/>
-      </w:pPr>
-      <w:r>
-        <w:t>XRSound version 3.0 is the first open-source version of XRSound, to coincide with the newly open-sourced Orbiter 2021 version.</w:t>
-      </w:r>
-    </w:p>
-    <w:p>
-      <w:pPr>
-        <w:jc w:val="both"/>
-      </w:pPr>
-    </w:p>
-    <w:p>
-      <w:pPr>
-        <w:jc w:val="both"/>
-      </w:pPr>
-      <w:r>
-        <w:t>XRSound 4.0 replaces the irrKlang sound engine with the open-source miniaudio library; thanks to Gondos for this work. XRSound no longer needs irrKlang.dll or the ikpMP3.dll and ikpFlac.dll plugins.</w:t>
-      </w:r>
-    </w:p>
-    <w:p>
-      <w:pPr>
-        <w:jc w:val="both"/>
-      </w:pPr>
-    </w:p>
+    <w:p/>
+    <w:p>
+      <w:r>
+        <w:lastRenderedPageBreak/>
+        <w:t xml:space="preserve">XRSound 4.0 replaces the irrKlang sound engine with the open-source </w:t>
+      </w:r>
+      <w:proofErr w:type="spellStart"/>
+      <w:r>
+        <w:t>miniaudio</w:t>
+      </w:r>
+      <w:proofErr w:type="spellEnd"/>
+      <w:r>
+        <w:t xml:space="preserve"> library; thanks to Gondos for this work. XRSound no longer needs irrKlang.dll or the ikpMP3.dll and ikpFlac.dll plugins.</w:t>
+      </w:r>
+    </w:p>
+    <w:p/>
     <w:p>
       <w:pPr>
         <w:pStyle w:val="Heading1"/>
@@ -1378,8 +1467,16 @@
         <w:rPr>
           <w:rStyle w:val="Courier10ptChar"/>
         </w:rPr>
-        <w:t>XRSound-&lt;vessel class&gt;.cfg</w:t>
-      </w:r>
+        <w:t>XRSound-&lt;vessel class&gt;.</w:t>
+      </w:r>
+      <w:proofErr w:type="spellStart"/>
+      <w:r>
+        <w:rPr>
+          <w:rStyle w:val="Courier10ptChar"/>
+        </w:rPr>
+        <w:t>cfg</w:t>
+      </w:r>
+      <w:proofErr w:type="spellEnd"/>
       <w:r>
         <w:rPr>
           <w:rFonts w:cs="Calibri"/>
@@ -1394,7 +1491,25 @@
           <w:color w:val="000000"/>
           <w:szCs w:val="20"/>
         </w:rPr>
-        <w:t>XRSound-DeltaGlider.cfg.</w:t>
+        <w:t>XRSound-</w:t>
+      </w:r>
+      <w:proofErr w:type="spellStart"/>
+      <w:r>
+        <w:rPr>
+          <w:rFonts w:ascii="Courier New" w:hAnsi="Courier New" w:cs="Courier New"/>
+          <w:color w:val="000000"/>
+          <w:szCs w:val="20"/>
+        </w:rPr>
+        <w:t>DeltaGlider.cfg</w:t>
+      </w:r>
+      <w:proofErr w:type="spellEnd"/>
+      <w:r>
+        <w:rPr>
+          <w:rFonts w:ascii="Courier New" w:hAnsi="Courier New" w:cs="Courier New"/>
+          <w:color w:val="000000"/>
+          <w:szCs w:val="20"/>
+        </w:rPr>
+        <w:t>.</w:t>
       </w:r>
     </w:p>
     <w:p>
@@ -1496,7 +1611,7 @@
         </w:rPr>
         <w:t xml:space="preserve">Includes over 450 default sound files, including all </w:t>
       </w:r>
-      <w:hyperlink r:id="rId19" w:history="1">
+      <w:hyperlink r:id="rId18" w:history="1">
         <w:r>
           <w:rPr>
             <w:rStyle w:val="Hyperlink"/>
@@ -1513,7 +1628,7 @@
         </w:rPr>
         <w:t xml:space="preserve"> voice callouts by actress </w:t>
       </w:r>
-      <w:hyperlink r:id="rId20" w:history="1">
+      <w:hyperlink r:id="rId19" w:history="1">
         <w:r>
           <w:rPr>
             <w:rStyle w:val="Hyperlink"/>
@@ -1530,7 +1645,7 @@
         </w:rPr>
         <w:t xml:space="preserve"> and 141 ATC callouts from STS-114 and STS-121 featuring CAPCOM </w:t>
       </w:r>
-      <w:hyperlink r:id="rId21" w:history="1">
+      <w:hyperlink r:id="rId20" w:history="1">
         <w:r>
           <w:rPr>
             <w:rStyle w:val="Hyperlink"/>
@@ -1605,6 +1720,7 @@
           <w:rFonts w:cs="Calibri"/>
           <w:szCs w:val="20"/>
         </w:rPr>
+        <w:lastRenderedPageBreak/>
         <w:t xml:space="preserve">Includes new </w:t>
       </w:r>
       <w:r>
@@ -1623,22 +1739,50 @@
         </w:rPr>
         <w:t xml:space="preserve"> ambient music track created by and licensed from Grzegorz Lorens ("</w:t>
       </w:r>
-      <w:hyperlink r:id="rId22" w:history="1">
-        <w:r>
-          <w:rPr>
-            <w:rStyle w:val="Hyperlink"/>
-            <w:rFonts w:cs="Calibri"/>
-            <w:szCs w:val="20"/>
-          </w:rPr>
-          <w:t>Loru</w:t>
-        </w:r>
-      </w:hyperlink>
-      <w:r>
-        <w:rPr>
-          <w:rFonts w:cs="Calibri"/>
-          <w:szCs w:val="20"/>
-        </w:rPr>
-        <w:t xml:space="preserve">" on Orbiter-Forum) that plays in external views in space by default. This is configurable like any other sound. (For a lossless version of Loru's </w:t>
+      <w:proofErr w:type="spellStart"/>
+      <w:r>
+        <w:fldChar w:fldCharType="begin"/>
+      </w:r>
+      <w:r>
+        <w:instrText>HYPERLINK "https://www.orbiter-forum.com/member.php?u=1580"</w:instrText>
+      </w:r>
+      <w:r>
+        <w:fldChar w:fldCharType="separate"/>
+      </w:r>
+      <w:r>
+        <w:rPr>
+          <w:rStyle w:val="Hyperlink"/>
+          <w:rFonts w:cs="Calibri"/>
+          <w:szCs w:val="20"/>
+        </w:rPr>
+        <w:t>Loru</w:t>
+      </w:r>
+      <w:proofErr w:type="spellEnd"/>
+      <w:r>
+        <w:fldChar w:fldCharType="end"/>
+      </w:r>
+      <w:r>
+        <w:rPr>
+          <w:rFonts w:cs="Calibri"/>
+          <w:szCs w:val="20"/>
+        </w:rPr>
+        <w:t xml:space="preserve">" on Orbiter-Forum) that plays in external views in space by default. This is configurable like any other sound. (For a lossless version of </w:t>
+      </w:r>
+      <w:proofErr w:type="spellStart"/>
+      <w:r>
+        <w:rPr>
+          <w:rFonts w:cs="Calibri"/>
+          <w:szCs w:val="20"/>
+        </w:rPr>
+        <w:t>Loru's</w:t>
+      </w:r>
+      <w:proofErr w:type="spellEnd"/>
+      <w:r>
+        <w:rPr>
+          <w:rFonts w:cs="Calibri"/>
+          <w:szCs w:val="20"/>
+        </w:rPr>
+        <w:t xml:space="preserve"> </w:t>
       </w:r>
       <w:r>
         <w:rPr>
@@ -1656,7 +1800,7 @@
         </w:rPr>
         <w:t xml:space="preserve">, see </w:t>
       </w:r>
-      <w:hyperlink r:id="rId23" w:history="1">
+      <w:hyperlink r:id="rId21" w:history="1">
         <w:r>
           <w:rPr>
             <w:rStyle w:val="Hyperlink"/>
@@ -2002,8 +2146,17 @@
           <w:rFonts w:ascii="Courier New" w:hAnsi="Courier New" w:cs="Courier New"/>
           <w:szCs w:val="20"/>
         </w:rPr>
-        <w:t>XRSound-&lt;class name&gt;.cfg</w:t>
-      </w:r>
+        <w:t>XRSound-&lt;class name&gt;.</w:t>
+      </w:r>
+      <w:proofErr w:type="spellStart"/>
+      <w:r>
+        <w:rPr>
+          <w:rFonts w:ascii="Courier New" w:hAnsi="Courier New" w:cs="Courier New"/>
+          <w:szCs w:val="20"/>
+        </w:rPr>
+        <w:t>cfg</w:t>
+      </w:r>
+      <w:proofErr w:type="spellEnd"/>
       <w:r>
         <w:rPr>
           <w:rFonts w:cs="Calibri"/>
@@ -2011,11 +2164,19 @@
         </w:rPr>
         <w:t xml:space="preserve"> file. [You can set `</w:t>
       </w:r>
+      <w:proofErr w:type="spellStart"/>
       <w:r>
         <w:rPr>
           <w:rStyle w:val="Courier10ptChar"/>
         </w:rPr>
-        <w:t>LogVesselAnimations = 1</w:t>
+        <w:t>LogVesselAnimations</w:t>
+      </w:r>
+      <w:proofErr w:type="spellEnd"/>
+      <w:r>
+        <w:rPr>
+          <w:rStyle w:val="Courier10ptChar"/>
+        </w:rPr>
+        <w:t xml:space="preserve"> = 1</w:t>
       </w:r>
       <w:r>
         <w:rPr>
@@ -2070,8 +2231,16 @@
         <w:rPr>
           <w:rStyle w:val="Courier10ptChar"/>
         </w:rPr>
-        <w:t>XRSound-&lt;vessel class&gt;.cfg</w:t>
-      </w:r>
+        <w:t>XRSound-&lt;vessel class&gt;.</w:t>
+      </w:r>
+      <w:proofErr w:type="spellStart"/>
+      <w:r>
+        <w:rPr>
+          <w:rStyle w:val="Courier10ptChar"/>
+        </w:rPr>
+        <w:t>cfg</w:t>
+      </w:r>
+      <w:proofErr w:type="spellEnd"/>
       <w:r>
         <w:rPr>
           <w:rFonts w:cs="Calibri"/>
@@ -2119,6 +2288,7 @@
           <w:rFonts w:cs="Calibri"/>
           <w:szCs w:val="20"/>
         </w:rPr>
+        <w:lastRenderedPageBreak/>
         <w:t>Takeoff and landing voice callouts ("100 knots", "Wheels up" / "Liftoff", "You are cleared to land", "Warning: gear is up", "Touchdown", "Wheel stop", etc.)</w:t>
       </w:r>
     </w:p>
@@ -2335,8 +2505,16 @@
         <w:rPr>
           <w:rStyle w:val="Courier10ptChar"/>
         </w:rPr>
-        <w:t>XRSound-&lt;vessel class&gt;.cfg</w:t>
-      </w:r>
+        <w:t>XRSound-&lt;vessel class&gt;.</w:t>
+      </w:r>
+      <w:proofErr w:type="spellStart"/>
+      <w:r>
+        <w:rPr>
+          <w:rStyle w:val="Courier10ptChar"/>
+        </w:rPr>
+        <w:t>cfg</w:t>
+      </w:r>
+      <w:proofErr w:type="spellEnd"/>
       <w:r>
         <w:rPr>
           <w:rFonts w:cs="Calibri"/>
@@ -2374,7 +2552,7 @@
         </w:rPr>
         <w:t xml:space="preserve">The new </w:t>
       </w:r>
-      <w:hyperlink r:id="rId24" w:history="1">
+      <w:hyperlink r:id="rId22" w:history="1">
         <w:r>
           <w:rPr>
             <w:rStyle w:val="Hyperlink"/>
@@ -2419,6 +2597,7 @@
           <w:rFonts w:cs="Calibri"/>
           <w:szCs w:val="20"/>
         </w:rPr>
+        <w:lastRenderedPageBreak/>
         <w:t xml:space="preserve">Can add sound events to any existing Orbiter vessel's animations simply by editing that vessel's class's </w:t>
       </w:r>
       <w:r>
@@ -2426,14 +2605,55 @@
           <w:rFonts w:ascii="Courier New" w:hAnsi="Courier New" w:cs="Courier New"/>
           <w:szCs w:val="20"/>
         </w:rPr>
-        <w:t>XRSound-&lt;classname&gt;.cfg</w:t>
-      </w:r>
-      <w:r>
-        <w:rPr>
-          <w:rFonts w:cs="Calibri"/>
-          <w:szCs w:val="20"/>
-        </w:rPr>
-        <w:t xml:space="preserve"> file. Includes .cfg files for each of the default Orbiter vessels.</w:t>
+        <w:t>XRSound-&lt;</w:t>
+      </w:r>
+      <w:proofErr w:type="spellStart"/>
+      <w:r>
+        <w:rPr>
+          <w:rFonts w:ascii="Courier New" w:hAnsi="Courier New" w:cs="Courier New"/>
+          <w:szCs w:val="20"/>
+        </w:rPr>
+        <w:t>classname</w:t>
+      </w:r>
+      <w:proofErr w:type="spellEnd"/>
+      <w:r>
+        <w:rPr>
+          <w:rFonts w:ascii="Courier New" w:hAnsi="Courier New" w:cs="Courier New"/>
+          <w:szCs w:val="20"/>
+        </w:rPr>
+        <w:t>&gt;.</w:t>
+      </w:r>
+      <w:proofErr w:type="spellStart"/>
+      <w:r>
+        <w:rPr>
+          <w:rFonts w:ascii="Courier New" w:hAnsi="Courier New" w:cs="Courier New"/>
+          <w:szCs w:val="20"/>
+        </w:rPr>
+        <w:t>cfg</w:t>
+      </w:r>
+      <w:proofErr w:type="spellEnd"/>
+      <w:r>
+        <w:rPr>
+          <w:rFonts w:cs="Calibri"/>
+          <w:szCs w:val="20"/>
+        </w:rPr>
+        <w:t xml:space="preserve"> file. Includes .</w:t>
+      </w:r>
+      <w:proofErr w:type="spellStart"/>
+      <w:r>
+        <w:rPr>
+          <w:rFonts w:cs="Calibri"/>
+          <w:szCs w:val="20"/>
+        </w:rPr>
+        <w:t>cfg</w:t>
+      </w:r>
+      <w:proofErr w:type="spellEnd"/>
+      <w:r>
+        <w:rPr>
+          <w:rFonts w:cs="Calibri"/>
+          <w:szCs w:val="20"/>
+        </w:rPr>
+        <w:t xml:space="preserve"> files for each of the default Orbiter vessels.</w:t>
       </w:r>
     </w:p>
     <w:p>
@@ -2738,9 +2958,11 @@
           <w:rFonts w:cs="Calibri"/>
           <w:szCs w:val="20"/>
         </w:rPr>
+        <w:lastRenderedPageBreak/>
         <w:t xml:space="preserve">Uses the </w:t>
       </w:r>
-      <w:hyperlink r:id="rId25" w:history="1">
+      <w:hyperlink r:id="rId23" w:history="1">
+        <w:proofErr w:type="spellStart"/>
         <w:r>
           <w:rPr>
             <w:rStyle w:val="Hyperlink"/>
@@ -2749,6 +2971,7 @@
           </w:rPr>
           <w:t>miniaudio</w:t>
         </w:r>
+        <w:proofErr w:type="spellEnd"/>
       </w:hyperlink>
       <w:r>
         <w:rPr>
@@ -2797,7 +3020,39 @@
           <w:rFonts w:cs="Calibri"/>
           <w:szCs w:val="20"/>
         </w:rPr>
-        <w:t>Ogg Vorbis (*.ogg)</w:t>
+        <w:t xml:space="preserve">Ogg </w:t>
+      </w:r>
+      <w:proofErr w:type="spellStart"/>
+      <w:r>
+        <w:rPr>
+          <w:rFonts w:cs="Calibri"/>
+          <w:szCs w:val="20"/>
+        </w:rPr>
+        <w:t>Vorbis</w:t>
+      </w:r>
+      <w:proofErr w:type="spellEnd"/>
+      <w:r>
+        <w:rPr>
+          <w:rFonts w:cs="Calibri"/>
+          <w:szCs w:val="20"/>
+        </w:rPr>
+        <w:t xml:space="preserve"> (*.</w:t>
+      </w:r>
+      <w:proofErr w:type="spellStart"/>
+      <w:r>
+        <w:rPr>
+          <w:rFonts w:cs="Calibri"/>
+          <w:szCs w:val="20"/>
+        </w:rPr>
+        <w:t>ogg</w:t>
+      </w:r>
+      <w:proofErr w:type="spellEnd"/>
+      <w:r>
+        <w:rPr>
+          <w:rFonts w:cs="Calibri"/>
+          <w:szCs w:val="20"/>
+        </w:rPr>
+        <w:t>)</w:t>
       </w:r>
     </w:p>
     <w:p>
@@ -2839,7 +3094,23 @@
           <w:rFonts w:cs="Calibri"/>
           <w:szCs w:val="20"/>
         </w:rPr>
-        <w:t>Free Lossless Audio Codec (*.flac)</w:t>
+        <w:t>Free Lossless Audio Codec (*.</w:t>
+      </w:r>
+      <w:proofErr w:type="spellStart"/>
+      <w:r>
+        <w:rPr>
+          <w:rFonts w:cs="Calibri"/>
+          <w:szCs w:val="20"/>
+        </w:rPr>
+        <w:t>flac</w:t>
+      </w:r>
+      <w:proofErr w:type="spellEnd"/>
+      <w:r>
+        <w:rPr>
+          <w:rFonts w:cs="Calibri"/>
+          <w:szCs w:val="20"/>
+        </w:rPr>
+        <w:t>)</w:t>
       </w:r>
     </w:p>
     <w:p>
@@ -2872,8 +3143,17 @@
           <w:rFonts w:ascii="Courier New" w:hAnsi="Courier New" w:cs="Courier New"/>
           <w:szCs w:val="20"/>
         </w:rPr>
-        <w:t>$ORBITER_ROOT\XRSound\XRSound*.cfg</w:t>
-      </w:r>
+        <w:t>$ORBITER_ROOT\XRSound\XRSound*.</w:t>
+      </w:r>
+      <w:proofErr w:type="spellStart"/>
+      <w:r>
+        <w:rPr>
+          <w:rFonts w:ascii="Courier New" w:hAnsi="Courier New" w:cs="Courier New"/>
+          <w:szCs w:val="20"/>
+        </w:rPr>
+        <w:t>cfg</w:t>
+      </w:r>
+      <w:proofErr w:type="spellEnd"/>
       <w:r>
         <w:rPr>
           <w:rFonts w:cs="Calibri"/>
@@ -2949,7 +3229,6 @@
     <w:p>
       <w:pPr>
         <w:pStyle w:val="Heading1"/>
-        <w:jc w:val="both"/>
       </w:pPr>
       <w:bookmarkStart w:id="3" w:name="_Toc243946902"/>
       <w:r>
@@ -2957,18 +3236,13 @@
       </w:r>
       <w:bookmarkEnd w:id="3"/>
     </w:p>
-    <w:p>
-      <w:pPr>
-        <w:jc w:val="both"/>
-      </w:pPr>
-    </w:p>
+    <w:p/>
     <w:p>
       <w:pPr>
         <w:numPr>
           <w:ilvl w:val="0"/>
           <w:numId w:val="5"/>
         </w:numPr>
-        <w:jc w:val="both"/>
       </w:pPr>
       <w:r>
         <w:t>Windows Vista or newer.</w:t>
@@ -2980,8 +3254,78 @@
           <w:ilvl w:val="0"/>
           <w:numId w:val="5"/>
         </w:numPr>
-        <w:jc w:val="both"/>
-      </w:pPr>
+      </w:pPr>
+      <w:hyperlink r:id="rId24" w:history="1">
+        <w:r>
+          <w:rPr>
+            <w:rStyle w:val="Hyperlink"/>
+          </w:rPr>
+          <w:t>Orbiter 2024</w:t>
+        </w:r>
+      </w:hyperlink>
+      <w:r>
+        <w:t xml:space="preserve"> or newer.  </w:t>
+      </w:r>
+      <w:r>
+        <w:rPr>
+          <w:u w:val="single"/>
+        </w:rPr>
+        <w:t>Older Orbiter releases are not supported by XRSound 4.0.</w:t>
+      </w:r>
+    </w:p>
+    <w:p>
+      <w:pPr>
+        <w:numPr>
+          <w:ilvl w:val="0"/>
+          <w:numId w:val="5"/>
+        </w:numPr>
+      </w:pPr>
+      <w:hyperlink r:id="rId25" w:history="1">
+        <w:r>
+          <w:rPr>
+            <w:rStyle w:val="Hyperlink"/>
+          </w:rPr>
+          <w:t>Microsoft Visual C++ Redistributable</w:t>
+        </w:r>
+      </w:hyperlink>
+      <w:r>
+        <w:t xml:space="preserve"> files (latest version).</w:t>
+      </w:r>
+    </w:p>
+    <w:p>
+      <w:pPr>
+        <w:pStyle w:val="ListParagraph"/>
+      </w:pPr>
+    </w:p>
+    <w:p>
+      <w:pPr>
+        <w:ind w:left="360"/>
+      </w:pPr>
+    </w:p>
+    <w:p>
+      <w:pPr>
+        <w:pStyle w:val="Heading1"/>
+      </w:pPr>
+      <w:bookmarkStart w:id="4" w:name="_Toc243946903"/>
+      <w:r>
+        <w:t>Installation</w:t>
+      </w:r>
+      <w:bookmarkEnd w:id="4"/>
+    </w:p>
+    <w:p/>
+    <w:p>
+      <w:r>
+        <w:t xml:space="preserve">This section details how to install and activate XRSound.  Note that XRSound is a plug-in for </w:t>
+      </w:r>
+      <w:r>
+        <w:rPr>
+          <w:i/>
+        </w:rPr>
+        <w:t xml:space="preserve">Orbiter </w:t>
+      </w:r>
+      <w:r>
+        <w:t xml:space="preserve">and requires that </w:t>
+      </w:r>
       <w:hyperlink r:id="rId26" w:history="1">
         <w:r>
           <w:rPr>
@@ -2991,24 +3335,54 @@
         </w:r>
       </w:hyperlink>
       <w:r>
-        <w:t xml:space="preserve"> or newer.  </w:t>
-      </w:r>
-      <w:r>
-        <w:rPr>
-          <w:u w:val="single"/>
-        </w:rPr>
-        <w:t>Older Orbiter releases are not supported by XRSound 4.0.</w:t>
-      </w:r>
-    </w:p>
+        <w:t xml:space="preserve"> or newer be installed first.  </w:t>
+      </w:r>
+    </w:p>
+    <w:p/>
     <w:p>
       <w:pPr>
         <w:numPr>
           <w:ilvl w:val="0"/>
-          <w:numId w:val="5"/>
+          <w:numId w:val="7"/>
         </w:numPr>
-        <w:jc w:val="both"/>
-      </w:pPr>
+        <w:spacing w:after="240"/>
+      </w:pPr>
+      <w:r>
+        <w:t xml:space="preserve">Install </w:t>
+      </w:r>
       <w:hyperlink r:id="rId27" w:history="1">
+        <w:r>
+          <w:rPr>
+            <w:rStyle w:val="Hyperlink"/>
+          </w:rPr>
+          <w:t>Orbiter 2024</w:t>
+        </w:r>
+      </w:hyperlink>
+      <w:r>
+        <w:t xml:space="preserve"> or newer.  </w:t>
+      </w:r>
+      <w:r>
+        <w:rPr>
+          <w:u w:val="single"/>
+        </w:rPr>
+        <w:t>Older versions of Orbiter are not supported</w:t>
+      </w:r>
+      <w:r>
+        <w:t xml:space="preserve"> by XRSound 4.0.</w:t>
+      </w:r>
+    </w:p>
+    <w:p>
+      <w:pPr>
+        <w:numPr>
+          <w:ilvl w:val="0"/>
+          <w:numId w:val="7"/>
+        </w:numPr>
+        <w:spacing w:after="240"/>
+      </w:pPr>
+      <w:r>
+        <w:t xml:space="preserve">Install the x86 (for 32-bit Orbiter) or x64 (for 64-bit Orbiter) </w:t>
+      </w:r>
+      <w:hyperlink r:id="rId28" w:history="1">
         <w:r>
           <w:rPr>
             <w:rStyle w:val="Hyperlink"/>
@@ -3022,95 +3396,23 @@
     </w:p>
     <w:p>
       <w:pPr>
-        <w:pStyle w:val="ListParagraph"/>
-      </w:pPr>
-    </w:p>
-    <w:p>
-      <w:pPr>
-        <w:ind w:left="360"/>
-        <w:jc w:val="both"/>
-      </w:pPr>
-    </w:p>
-    <w:p>
-      <w:pPr>
-        <w:pStyle w:val="Heading1"/>
-        <w:jc w:val="both"/>
-      </w:pPr>
-      <w:bookmarkStart w:id="4" w:name="_Toc243946903"/>
-      <w:r>
-        <w:t>Installation</w:t>
-      </w:r>
-      <w:bookmarkEnd w:id="4"/>
-    </w:p>
-    <w:p>
-      <w:pPr>
-        <w:jc w:val="both"/>
-      </w:pPr>
-    </w:p>
-    <w:p>
-      <w:pPr>
-        <w:jc w:val="both"/>
-      </w:pPr>
-      <w:r>
-        <w:t xml:space="preserve">This section details how to install and activate XRSound.  Note that XRSound is a plug-in for </w:t>
-      </w:r>
-      <w:r>
-        <w:rPr>
-          <w:i/>
-        </w:rPr>
-        <w:t xml:space="preserve">Orbiter </w:t>
-      </w:r>
-      <w:r>
-        <w:t xml:space="preserve">and requires that </w:t>
-      </w:r>
-      <w:hyperlink r:id="rId28" w:history="1">
-        <w:r>
-          <w:rPr>
-            <w:rStyle w:val="Hyperlink"/>
-          </w:rPr>
-          <w:t>Orbiter 2024</w:t>
-        </w:r>
-      </w:hyperlink>
-      <w:r>
-        <w:t xml:space="preserve"> or newer be installed first.  </w:t>
-      </w:r>
-    </w:p>
-    <w:p>
-      <w:pPr>
-        <w:jc w:val="both"/>
-      </w:pPr>
-    </w:p>
-    <w:p>
-      <w:pPr>
         <w:numPr>
           <w:ilvl w:val="0"/>
           <w:numId w:val="7"/>
         </w:numPr>
         <w:spacing w:after="240"/>
-        <w:jc w:val="both"/>
-      </w:pPr>
-      <w:r>
-        <w:t xml:space="preserve">Install </w:t>
-      </w:r>
-      <w:hyperlink r:id="rId29" w:history="1">
-        <w:r>
-          <w:rPr>
-            <w:rStyle w:val="Hyperlink"/>
-          </w:rPr>
-          <w:t>Orbiter 2024</w:t>
-        </w:r>
-      </w:hyperlink>
-      <w:r>
-        <w:t xml:space="preserve"> or newer.  </w:t>
-      </w:r>
-      <w:r>
-        <w:rPr>
-          <w:u w:val="single"/>
-        </w:rPr>
-        <w:t>Older versions of Orbiter are not supported</w:t>
-      </w:r>
-      <w:r>
-        <w:t xml:space="preserve"> by XRSound 4.0.</w:t>
+      </w:pPr>
+      <w:r>
+        <w:t xml:space="preserve">XRSound is included with Orbiter 2024 and newer.  If you are installing a separate XRSound release, unzip it into your </w:t>
+      </w:r>
+      <w:r>
+        <w:rPr>
+          <w:rFonts w:ascii="Courier New" w:hAnsi="Courier New" w:cs="Courier New"/>
+        </w:rPr>
+        <w:t>$ORBITER_ROOT</w:t>
+      </w:r>
+      <w:r>
+        <w:t xml:space="preserve"> (e.g., C:\Orbiter) directory.</w:t>
       </w:r>
     </w:p>
     <w:p>
@@ -3120,21 +3422,9 @@
           <w:numId w:val="7"/>
         </w:numPr>
         <w:spacing w:after="240"/>
-        <w:jc w:val="both"/>
-      </w:pPr>
-      <w:r>
-        <w:t xml:space="preserve">Install the x86 (for 32-bit Orbiter) or x64 (for 64-bit Orbiter) </w:t>
-      </w:r>
-      <w:hyperlink r:id="rId30" w:history="1">
-        <w:r>
-          <w:rPr>
-            <w:rStyle w:val="Hyperlink"/>
-          </w:rPr>
-          <w:t>Microsoft Visual C++ Redistributable</w:t>
-        </w:r>
-      </w:hyperlink>
-      <w:r>
-        <w:t xml:space="preserve"> files (latest version).</w:t>
+      </w:pPr>
+      <w:r>
+        <w:t xml:space="preserve">Bring up Orbiter to display the Orbiter Launchpad. </w:t>
       </w:r>
     </w:p>
     <w:p>
@@ -3144,19 +3434,18 @@
           <w:numId w:val="7"/>
         </w:numPr>
         <w:spacing w:after="240"/>
-        <w:jc w:val="both"/>
-      </w:pPr>
-      <w:r>
-        <w:t xml:space="preserve">XRSound is included with Orbiter 2024 and newer.  If you are installing a separate XRSound release, unzip it into your </w:t>
-      </w:r>
-      <w:r>
-        <w:rPr>
-          <w:rFonts w:ascii="Courier New" w:hAnsi="Courier New" w:cs="Courier New"/>
-        </w:rPr>
-        <w:t>$ORBITER_ROOT</w:t>
-      </w:r>
-      <w:r>
-        <w:t xml:space="preserve"> (e.g., C:\Orbiter) directory.</w:t>
+      </w:pPr>
+      <w:r>
+        <w:t xml:space="preserve">Click the </w:t>
+      </w:r>
+      <w:r>
+        <w:rPr>
+          <w:i/>
+        </w:rPr>
+        <w:t>Modules</w:t>
+      </w:r>
+      <w:r>
+        <w:t xml:space="preserve"> button.  </w:t>
       </w:r>
     </w:p>
     <w:p>
@@ -3166,42 +3455,6 @@
           <w:numId w:val="7"/>
         </w:numPr>
         <w:spacing w:after="240"/>
-        <w:jc w:val="both"/>
-      </w:pPr>
-      <w:r>
-        <w:t xml:space="preserve">Bring up Orbiter to display the Orbiter Launchpad. </w:t>
-      </w:r>
-    </w:p>
-    <w:p>
-      <w:pPr>
-        <w:numPr>
-          <w:ilvl w:val="0"/>
-          <w:numId w:val="7"/>
-        </w:numPr>
-        <w:spacing w:after="240"/>
-        <w:jc w:val="both"/>
-      </w:pPr>
-      <w:r>
-        <w:t xml:space="preserve">Click the </w:t>
-      </w:r>
-      <w:r>
-        <w:rPr>
-          <w:i/>
-        </w:rPr>
-        <w:t>Modules</w:t>
-      </w:r>
-      <w:r>
-        <w:t xml:space="preserve"> button.  </w:t>
-      </w:r>
-    </w:p>
-    <w:p>
-      <w:pPr>
-        <w:numPr>
-          <w:ilvl w:val="0"/>
-          <w:numId w:val="7"/>
-        </w:numPr>
-        <w:spacing w:after="240"/>
-        <w:jc w:val="both"/>
       </w:pPr>
       <w:r>
         <w:t xml:space="preserve">Click the checkbox next to </w:t>
@@ -3240,7 +3493,6 @@
       <w:pPr>
         <w:spacing w:after="240"/>
         <w:ind w:left="360"/>
-        <w:jc w:val="both"/>
         <w:rPr>
           <w:iCs/>
         </w:rPr>
@@ -3249,9 +3501,38 @@
         <w:rPr>
           <w:i/>
         </w:rPr>
-        <w:t xml:space="preserve">Note: if you previously installed the OrbiterSound module, deactivate it by unchecking it in the same section.  Otherwise, its default vessel sounds will conflict with XRSound’s default vessel sounds. However, you can install Face’s </w:t>
-      </w:r>
-      <w:hyperlink r:id="rId31" w:history="1">
+        <w:t xml:space="preserve">Note: if you previously installed the </w:t>
+      </w:r>
+      <w:proofErr w:type="spellStart"/>
+      <w:r>
+        <w:rPr>
+          <w:i/>
+        </w:rPr>
+        <w:t>OrbiterSound</w:t>
+      </w:r>
+      <w:proofErr w:type="spellEnd"/>
+      <w:r>
+        <w:rPr>
+          <w:i/>
+        </w:rPr>
+        <w:t xml:space="preserve"> module, deactivate it by unchecking it in the same section.  Otherwise, its default vessel sounds will conflict with </w:t>
+      </w:r>
+      <w:proofErr w:type="spellStart"/>
+      <w:r>
+        <w:rPr>
+          <w:i/>
+        </w:rPr>
+        <w:t>XRSound’s</w:t>
+      </w:r>
+      <w:proofErr w:type="spellEnd"/>
+      <w:r>
+        <w:rPr>
+          <w:i/>
+        </w:rPr>
+        <w:t xml:space="preserve"> default vessel sounds. However, you can install Face’s </w:t>
+      </w:r>
+      <w:hyperlink r:id="rId29" w:history="1">
+        <w:proofErr w:type="spellStart"/>
         <w:r>
           <w:rPr>
             <w:rStyle w:val="Hyperlink"/>
@@ -3259,23 +3540,45 @@
           </w:rPr>
           <w:t>SoundBridge</w:t>
         </w:r>
+        <w:proofErr w:type="spellEnd"/>
       </w:hyperlink>
       <w:r>
         <w:rPr>
           <w:i/>
         </w:rPr>
-        <w:t xml:space="preserve"> module to seamlessly route OrbiterSound calls to XRSound if you have vessels installed that require OrbiterSound.</w:t>
-      </w:r>
-    </w:p>
-    <w:p>
-      <w:pPr>
-        <w:jc w:val="both"/>
-      </w:pPr>
-    </w:p>
-    <w:p>
-      <w:pPr>
-        <w:jc w:val="both"/>
-      </w:pPr>
+        <w:t xml:space="preserve"> module to seamlessly route </w:t>
+      </w:r>
+      <w:proofErr w:type="spellStart"/>
+      <w:r>
+        <w:rPr>
+          <w:i/>
+        </w:rPr>
+        <w:t>OrbiterSound</w:t>
+      </w:r>
+      <w:proofErr w:type="spellEnd"/>
+      <w:r>
+        <w:rPr>
+          <w:i/>
+        </w:rPr>
+        <w:t xml:space="preserve"> calls to XRSound if you have vessels installed that require </w:t>
+      </w:r>
+      <w:proofErr w:type="spellStart"/>
+      <w:r>
+        <w:rPr>
+          <w:i/>
+        </w:rPr>
+        <w:t>OrbiterSound</w:t>
+      </w:r>
+      <w:proofErr w:type="spellEnd"/>
+      <w:r>
+        <w:rPr>
+          <w:i/>
+        </w:rPr>
+        <w:t>.</w:t>
+      </w:r>
+    </w:p>
+    <w:p/>
+    <w:p>
       <w:r>
         <w:t xml:space="preserve">Now run Orbiter and load any of the launch scenarios; you should hear an audio greeting voice callout when the simulation starts.  If you don’t, look at </w:t>
       </w:r>
@@ -3298,11 +3601,7 @@
         <w:t>.</w:t>
       </w:r>
     </w:p>
-    <w:p>
-      <w:pPr>
-        <w:jc w:val="both"/>
-      </w:pPr>
-    </w:p>
+    <w:p/>
     <w:p>
       <w:pPr>
         <w:jc w:val="center"/>
@@ -3332,15 +3631,12 @@
       </w:pPr>
       <w:bookmarkStart w:id="5" w:name="_Toc243946904"/>
       <w:r>
+        <w:lastRenderedPageBreak/>
         <w:t>Configuring XRSound</w:t>
       </w:r>
       <w:bookmarkEnd w:id="5"/>
     </w:p>
-    <w:p>
-      <w:pPr>
-        <w:jc w:val="both"/>
-      </w:pPr>
-    </w:p>
+    <w:p/>
     <w:p>
       <w:r>
         <w:t xml:space="preserve">XRSound is fully configurable and allows users to replace or disable any sound or voice callout either globally, via the </w:t>
@@ -3358,8 +3654,16 @@
         <w:rPr>
           <w:rStyle w:val="Courier10ptChar"/>
         </w:rPr>
-        <w:t>$ORBITER_ROOT\XRSound\XRSound-&lt;vessel class name&gt;.cfg</w:t>
-      </w:r>
+        <w:t>$ORBITER_ROOT\XRSound\XRSound-&lt;vessel class name&gt;.</w:t>
+      </w:r>
+      <w:proofErr w:type="spellStart"/>
+      <w:r>
+        <w:rPr>
+          <w:rStyle w:val="Courier10ptChar"/>
+        </w:rPr>
+        <w:t>cfg</w:t>
+      </w:r>
+      <w:proofErr w:type="spellEnd"/>
       <w:r>
         <w:t xml:space="preserve"> file (for example </w:t>
       </w:r>
@@ -3370,7 +3674,15 @@
         <w:t>C:\Orbiter\XRSound\XRSound-DeltaGlider.cfg</w:t>
       </w:r>
       <w:r>
-        <w:t xml:space="preserve">).  Settings in the vessel class’s .cfg file override any corresponding settings in the global </w:t>
+        <w:t>).  Settings in the vessel class’s .</w:t>
+      </w:r>
+      <w:proofErr w:type="spellStart"/>
+      <w:r>
+        <w:t>cfg</w:t>
+      </w:r>
+      <w:proofErr w:type="spellEnd"/>
+      <w:r>
+        <w:t xml:space="preserve"> file override any corresponding settings in the global </w:t>
       </w:r>
       <w:r>
         <w:rPr>
@@ -3382,15 +3694,8 @@
         <w:t xml:space="preserve"> file.  </w:t>
       </w:r>
     </w:p>
-    <w:p>
-      <w:pPr>
-        <w:jc w:val="both"/>
-      </w:pPr>
-    </w:p>
-    <w:p>
-      <w:pPr>
-        <w:jc w:val="both"/>
-      </w:pPr>
+    <w:p/>
+    <w:p>
       <w:r>
         <w:t xml:space="preserve">Refer to the comments in </w:t>
       </w:r>
@@ -3404,11 +3709,7 @@
         <w:t xml:space="preserve"> for details about how to configure XRSound.  </w:t>
       </w:r>
     </w:p>
-    <w:p>
-      <w:pPr>
-        <w:jc w:val="both"/>
-      </w:pPr>
-    </w:p>
+    <w:p/>
     <w:p>
       <w:pPr>
         <w:pStyle w:val="Heading1"/>
@@ -3422,7 +3723,15 @@
     <w:p/>
     <w:p>
       <w:r>
-        <w:t xml:space="preserve">There are two ways to define custom sounds and/or voice callouts to an existing vessel.  The first is to use the XRSound C++ API and make XRSound calls from the vessel’s source code.  This allows you full access to all XRSound’s features, but also requires you to have access to the vessel’s source code.  </w:t>
+        <w:t xml:space="preserve">There are two ways to define custom sounds and/or voice callouts to an existing vessel.  The first is to use the XRSound C++ API and make XRSound calls from the vessel’s source code.  This allows you full access to all </w:t>
+      </w:r>
+      <w:proofErr w:type="spellStart"/>
+      <w:r>
+        <w:t>XRSound’s</w:t>
+      </w:r>
+      <w:proofErr w:type="spellEnd"/>
+      <w:r>
+        <w:t xml:space="preserve"> features, but also requires you to have access to the vessel’s source code.  </w:t>
       </w:r>
     </w:p>
     <w:p/>
@@ -3434,10 +3743,52 @@
         <w:rPr>
           <w:rStyle w:val="Courier10ptChar"/>
         </w:rPr>
-        <w:t>$ORBITER_ROOT\XRSound\XRSound-&lt;className&gt;.cfg</w:t>
-      </w:r>
-      <w:r>
-        <w:t xml:space="preserve"> file for the vessel’s class in Orbiter.  In addition to defining (or “overriding”) any default sounds defined in XRSound.cfg, you can also define new sounds for any of the vessel’s animations (for example, a nosecone opening or closing), as well as define one custom engine sound (for example, SCRAMJETS on the default DeltaGlider-S).  XRSound includes custom .cfg files for each of Orbiter’s default vessels.  For example, the DeltaGlider-S’s Orbiter class name is “DG-S”, and so its custom XRSound.cfg file is named XRSound-DG-S.cfg.</w:t>
+        <w:t>$ORBITER_ROOT\XRSound\XRSound-&lt;</w:t>
+      </w:r>
+      <w:proofErr w:type="spellStart"/>
+      <w:r>
+        <w:rPr>
+          <w:rStyle w:val="Courier10ptChar"/>
+        </w:rPr>
+        <w:t>className</w:t>
+      </w:r>
+      <w:proofErr w:type="spellEnd"/>
+      <w:r>
+        <w:rPr>
+          <w:rStyle w:val="Courier10ptChar"/>
+        </w:rPr>
+        <w:t>&gt;.</w:t>
+      </w:r>
+      <w:proofErr w:type="spellStart"/>
+      <w:r>
+        <w:rPr>
+          <w:rStyle w:val="Courier10ptChar"/>
+        </w:rPr>
+        <w:t>cfg</w:t>
+      </w:r>
+      <w:proofErr w:type="spellEnd"/>
+      <w:r>
+        <w:t xml:space="preserve"> file for the vessel’s class in Orbiter.  In addition to defining (or “overriding”) any default sounds defined in XRSound.cfg, you can also define new sounds for any of the vessel’s animations (for example, a nosecone opening or closing), as well as define one custom engine sound (for example, SCRAMJETS on the default DeltaGlider-S).  XRSound includes custom .</w:t>
+      </w:r>
+      <w:proofErr w:type="spellStart"/>
+      <w:r>
+        <w:t>cfg</w:t>
+      </w:r>
+      <w:proofErr w:type="spellEnd"/>
+      <w:r>
+        <w:t xml:space="preserve"> files for each of Orbiter’s default vessels.  For example, the </w:t>
+      </w:r>
+      <w:r>
+        <w:lastRenderedPageBreak/>
+        <w:t>DeltaGlider-S’s Orbiter class name is “DG-S”, and so its custom XRSound.cfg file is named XRSound-DG-</w:t>
+      </w:r>
+      <w:proofErr w:type="spellStart"/>
+      <w:r>
+        <w:t>S.cfg</w:t>
+      </w:r>
+      <w:proofErr w:type="spellEnd"/>
+      <w:r>
+        <w:t>.</w:t>
       </w:r>
     </w:p>
     <w:p/>
@@ -3457,8 +3808,16 @@
         <w:rPr>
           <w:rStyle w:val="Courier10ptChar"/>
         </w:rPr>
-        <w:t>Foo/BarClass</w:t>
-      </w:r>
+        <w:t>Foo/</w:t>
+      </w:r>
+      <w:proofErr w:type="spellStart"/>
+      <w:r>
+        <w:rPr>
+          <w:rStyle w:val="Courier10ptChar"/>
+        </w:rPr>
+        <w:t>BarClass</w:t>
+      </w:r>
+      <w:proofErr w:type="spellEnd"/>
       <w:r>
         <w:rPr>
           <w:rFonts w:ascii="Calibri" w:hAnsi="Calibri" w:cs="Calibri"/>
@@ -3481,12 +3840,14 @@
         </w:rPr>
         <w:t xml:space="preserve"> </w:t>
       </w:r>
+      <w:proofErr w:type="spellStart"/>
       <w:r>
         <w:rPr>
           <w:rStyle w:val="Courier10ptChar"/>
         </w:rPr>
         <w:t>Foo_BarClass</w:t>
       </w:r>
+      <w:proofErr w:type="spellEnd"/>
       <w:r>
         <w:rPr>
           <w:rFonts w:ascii="Calibri" w:hAnsi="Calibri" w:cs="Calibri"/>
@@ -3514,8 +3875,16 @@
         <w:rPr>
           <w:rStyle w:val="Courier10ptChar"/>
         </w:rPr>
-        <w:t>XRSound-Foo_BarClass.cfg</w:t>
-      </w:r>
+        <w:t>XRSound-</w:t>
+      </w:r>
+      <w:proofErr w:type="spellStart"/>
+      <w:r>
+        <w:rPr>
+          <w:rStyle w:val="Courier10ptChar"/>
+        </w:rPr>
+        <w:t>Foo_BarClass.cfg</w:t>
+      </w:r>
+      <w:proofErr w:type="spellEnd"/>
       <w:r>
         <w:rPr>
           <w:rFonts w:ascii="Calibri" w:hAnsi="Calibri" w:cs="Calibri"/>
@@ -3564,11 +3933,19 @@
           <w:rFonts w:ascii="Courier New" w:hAnsi="Courier New" w:cs="Courier New"/>
         </w:rPr>
       </w:pPr>
+      <w:proofErr w:type="spellStart"/>
       <w:r>
         <w:rPr>
           <w:rFonts w:ascii="Courier New" w:hAnsi="Courier New" w:cs="Courier New"/>
         </w:rPr>
-        <w:t>EnableVerboseLogging = 1</w:t>
+        <w:t>EnableVerboseLogging</w:t>
+      </w:r>
+      <w:proofErr w:type="spellEnd"/>
+      <w:r>
+        <w:rPr>
+          <w:rFonts w:ascii="Courier New" w:hAnsi="Courier New" w:cs="Courier New"/>
+        </w:rPr>
+        <w:t xml:space="preserve"> = 1</w:t>
       </w:r>
     </w:p>
     <w:p>
@@ -3580,11 +3957,19 @@
           <w:rFonts w:ascii="Courier New" w:hAnsi="Courier New" w:cs="Courier New"/>
         </w:rPr>
       </w:pPr>
+      <w:proofErr w:type="spellStart"/>
       <w:r>
         <w:rPr>
           <w:rFonts w:ascii="Courier New" w:hAnsi="Courier New" w:cs="Courier New"/>
         </w:rPr>
-        <w:t>LogVesselAnimations = 1</w:t>
+        <w:t>LogVesselAnimations</w:t>
+      </w:r>
+      <w:proofErr w:type="spellEnd"/>
+      <w:r>
+        <w:rPr>
+          <w:rFonts w:ascii="Courier New" w:hAnsi="Courier New" w:cs="Courier New"/>
+        </w:rPr>
+        <w:t xml:space="preserve"> = 1</w:t>
       </w:r>
     </w:p>
     <w:p>
@@ -3596,11 +3981,19 @@
           <w:rFonts w:ascii="Courier New" w:hAnsi="Courier New" w:cs="Courier New"/>
         </w:rPr>
       </w:pPr>
+      <w:proofErr w:type="spellStart"/>
       <w:r>
         <w:rPr>
           <w:rFonts w:ascii="Courier New" w:hAnsi="Courier New" w:cs="Courier New"/>
         </w:rPr>
-        <w:t xml:space="preserve">LogThrusterData = 1  </w:t>
+        <w:t>LogThrusterData</w:t>
+      </w:r>
+      <w:proofErr w:type="spellEnd"/>
+      <w:r>
+        <w:rPr>
+          <w:rFonts w:ascii="Courier New" w:hAnsi="Courier New" w:cs="Courier New"/>
+        </w:rPr>
+        <w:t xml:space="preserve"> = 1  </w:t>
       </w:r>
     </w:p>
     <w:p>
@@ -3688,7 +4081,36 @@
         <w:rPr>
           <w:rFonts w:ascii="Courier New" w:hAnsi="Courier New" w:cs="Courier New"/>
         </w:rPr>
-        <w:t>[GL-01]   &gt;&gt; LogVesselAnimations: [DeltaGlider][animation ID = 7, state = Moving]</w:t>
+        <w:lastRenderedPageBreak/>
+        <w:t xml:space="preserve">[GL-01]   &gt;&gt; </w:t>
+      </w:r>
+      <w:proofErr w:type="spellStart"/>
+      <w:r>
+        <w:rPr>
+          <w:rFonts w:ascii="Courier New" w:hAnsi="Courier New" w:cs="Courier New"/>
+        </w:rPr>
+        <w:t>LogVesselAnimations</w:t>
+      </w:r>
+      <w:proofErr w:type="spellEnd"/>
+      <w:r>
+        <w:rPr>
+          <w:rFonts w:ascii="Courier New" w:hAnsi="Courier New" w:cs="Courier New"/>
+        </w:rPr>
+        <w:t>: [DeltaGlider</w:t>
+      </w:r>
+      <w:proofErr w:type="gramStart"/>
+      <w:r>
+        <w:rPr>
+          <w:rFonts w:ascii="Courier New" w:hAnsi="Courier New" w:cs="Courier New"/>
+        </w:rPr>
+        <w:t>][</w:t>
+      </w:r>
+      <w:proofErr w:type="gramEnd"/>
+      <w:r>
+        <w:rPr>
+          <w:rFonts w:ascii="Courier New" w:hAnsi="Courier New" w:cs="Courier New"/>
+        </w:rPr>
+        <w:t>animation ID = 7, state = Moving]</w:t>
       </w:r>
     </w:p>
     <w:p>
@@ -3754,10 +4176,26 @@
         <w:rPr>
           <w:rStyle w:val="Courier10ptChar"/>
         </w:rPr>
-        <w:t>$ORBITER_ROOT\XRSound\XRSound-DeltaGlider.cfg</w:t>
-      </w:r>
-      <w:r>
-        <w:t>.  Open that file in your favorite text editor.  (If the file does not exist yet, copy an existing vessel’s cfg file as a template and then delete any existing settings in it before defining new ones.)</w:t>
+        <w:t>$ORBITER_ROOT\XRSound\XRSound-</w:t>
+      </w:r>
+      <w:proofErr w:type="spellStart"/>
+      <w:r>
+        <w:rPr>
+          <w:rStyle w:val="Courier10ptChar"/>
+        </w:rPr>
+        <w:t>DeltaGlider.cfg</w:t>
+      </w:r>
+      <w:proofErr w:type="spellEnd"/>
+      <w:r>
+        <w:t xml:space="preserve">.  Open that file in your favorite text editor.  (If the file does not exist yet, copy an existing vessel’s </w:t>
+      </w:r>
+      <w:proofErr w:type="spellStart"/>
+      <w:r>
+        <w:t>cfg</w:t>
+      </w:r>
+      <w:proofErr w:type="spellEnd"/>
+      <w:r>
+        <w:t xml:space="preserve"> file as a template and then delete any existing settings in it before defining new ones.)</w:t>
       </w:r>
     </w:p>
     <w:p>
@@ -3773,14 +4211,30 @@
         </w:numPr>
       </w:pPr>
       <w:r>
-        <w:t xml:space="preserve">Add or edit sounds for the animation events for the animation ID you are interested in (e.g., ID 7 for the DeltaGlider’s landing gear).  Refer to the comments in </w:t>
+        <w:t xml:space="preserve">Add or edit sounds for the animation events for the animation ID you are interested in (e.g., ID 7 for the </w:t>
+      </w:r>
+      <w:proofErr w:type="spellStart"/>
+      <w:r>
+        <w:t>DeltaGlider’s</w:t>
+      </w:r>
+      <w:proofErr w:type="spellEnd"/>
+      <w:r>
+        <w:t xml:space="preserve"> landing gear).  Refer to the comments in </w:t>
       </w:r>
       <w:r>
         <w:rPr>
           <w:rStyle w:val="Courier10ptChar"/>
         </w:rPr>
-        <w:t>$ORBITER_ROOT\XRSound\XRSound-DeltaGlider.cfg</w:t>
-      </w:r>
+        <w:t>$ORBITER_ROOT\XRSound\XRSound-</w:t>
+      </w:r>
+      <w:proofErr w:type="spellStart"/>
+      <w:r>
+        <w:rPr>
+          <w:rStyle w:val="Courier10ptChar"/>
+        </w:rPr>
+        <w:t>DeltaGlider.cfg</w:t>
+      </w:r>
+      <w:proofErr w:type="spellEnd"/>
       <w:r>
         <w:t xml:space="preserve"> for details about when each custom animation sound and/or thruster sound plays.</w:t>
       </w:r>
@@ -3819,11 +4273,19 @@
           <w:rFonts w:ascii="Courier New" w:hAnsi="Courier New" w:cs="Courier New"/>
         </w:rPr>
       </w:pPr>
+      <w:proofErr w:type="spellStart"/>
       <w:r>
         <w:rPr>
           <w:rFonts w:ascii="Courier New" w:hAnsi="Courier New" w:cs="Courier New"/>
         </w:rPr>
-        <w:t>EnableVerboseLogging = 0</w:t>
+        <w:t>EnableVerboseLogging</w:t>
+      </w:r>
+      <w:proofErr w:type="spellEnd"/>
+      <w:r>
+        <w:rPr>
+          <w:rFonts w:ascii="Courier New" w:hAnsi="Courier New" w:cs="Courier New"/>
+        </w:rPr>
+        <w:t xml:space="preserve"> = 0</w:t>
       </w:r>
     </w:p>
     <w:p>
@@ -3835,11 +4297,19 @@
           <w:rFonts w:ascii="Courier New" w:hAnsi="Courier New" w:cs="Courier New"/>
         </w:rPr>
       </w:pPr>
+      <w:proofErr w:type="spellStart"/>
       <w:r>
         <w:rPr>
           <w:rFonts w:ascii="Courier New" w:hAnsi="Courier New" w:cs="Courier New"/>
         </w:rPr>
-        <w:t>LogVesselAnimations = 0</w:t>
+        <w:t>LogVesselAnimations</w:t>
+      </w:r>
+      <w:proofErr w:type="spellEnd"/>
+      <w:r>
+        <w:rPr>
+          <w:rFonts w:ascii="Courier New" w:hAnsi="Courier New" w:cs="Courier New"/>
+        </w:rPr>
+        <w:t xml:space="preserve"> = 0</w:t>
       </w:r>
     </w:p>
     <w:p>
@@ -3848,11 +4318,19 @@
         <w:ind w:firstLine="720"/>
         <w:contextualSpacing/>
       </w:pPr>
+      <w:proofErr w:type="spellStart"/>
       <w:r>
         <w:rPr>
           <w:rFonts w:ascii="Courier New" w:hAnsi="Courier New" w:cs="Courier New"/>
         </w:rPr>
-        <w:t>LogThrusterData = 0</w:t>
+        <w:t>LogThrusterData</w:t>
+      </w:r>
+      <w:proofErr w:type="spellEnd"/>
+      <w:r>
+        <w:rPr>
+          <w:rFonts w:ascii="Courier New" w:hAnsi="Courier New" w:cs="Courier New"/>
+        </w:rPr>
+        <w:t xml:space="preserve"> = 0</w:t>
       </w:r>
     </w:p>
     <w:p/>
@@ -3870,6 +4348,7 @@
     <w:p/>
     <w:p>
       <w:r>
+        <w:lastRenderedPageBreak/>
         <w:t xml:space="preserve">XRSound includes a simple, easy-to-use API to play and manipulate sounds from a vessel.  These SDK files are installed to </w:t>
       </w:r>
       <w:r>
@@ -4021,15 +4500,28 @@
       </w:r>
       <w:r>
         <w:br/>
-        <w:t>enum MySounds</w:t>
-      </w:r>
+        <w:t xml:space="preserve">enum </w:t>
+      </w:r>
+      <w:proofErr w:type="spellStart"/>
+      <w:r>
+        <w:t>MySounds</w:t>
+      </w:r>
+      <w:proofErr w:type="spellEnd"/>
       <w:r>
         <w:br/>
         <w:t>{</w:t>
       </w:r>
       <w:r>
         <w:br/>
-        <w:t xml:space="preserve">    SystemReset, // value 0</w:t>
+        <w:t xml:space="preserve">    </w:t>
+      </w:r>
+      <w:proofErr w:type="spellStart"/>
+      <w:r>
+        <w:t>SystemReset</w:t>
+      </w:r>
+      <w:proofErr w:type="spellEnd"/>
+      <w:r>
+        <w:t>, // value 0</w:t>
       </w:r>
     </w:p>
     <w:p>
@@ -4037,7 +4529,15 @@
         <w:pStyle w:val="Courier10pt"/>
       </w:pPr>
       <w:r>
-        <w:t xml:space="preserve">    SomeOtherSound,</w:t>
+        <w:t xml:space="preserve">    </w:t>
+      </w:r>
+      <w:proofErr w:type="spellStart"/>
+      <w:r>
+        <w:t>SomeOtherSound</w:t>
+      </w:r>
+      <w:proofErr w:type="spellEnd"/>
+      <w:r>
+        <w:t>,</w:t>
       </w:r>
     </w:p>
     <w:p>
@@ -4061,6 +4561,9 @@
       </w:r>
       <w:r>
         <w:br/>
+      </w:r>
+      <w:r>
+        <w:lastRenderedPageBreak/>
         <w:t>{</w:t>
       </w:r>
       <w:r>
@@ -4073,7 +4576,15 @@
       </w:r>
       <w:r>
         <w:br/>
-        <w:t xml:space="preserve">    bool m_bResettingTheSystem;</w:t>
+        <w:t xml:space="preserve">    bool </w:t>
+      </w:r>
+      <w:proofErr w:type="spellStart"/>
+      <w:r>
+        <w:t>m_bResettingTheSystem</w:t>
+      </w:r>
+      <w:proofErr w:type="spellEnd"/>
+      <w:r>
+        <w:t>;</w:t>
       </w:r>
       <w:r>
         <w:br/>
@@ -4085,7 +4596,15 @@
       </w:r>
       <w:r>
         <w:br/>
-        <w:t>void MyVessel::clbkPostCreation()</w:t>
+        <w:t>void MyVessel::</w:t>
+      </w:r>
+      <w:proofErr w:type="spellStart"/>
+      <w:r>
+        <w:t>clbkPostCreation</w:t>
+      </w:r>
+      <w:proofErr w:type="spellEnd"/>
+      <w:r>
+        <w:t>()</w:t>
       </w:r>
       <w:r>
         <w:br/>
@@ -4093,7 +4612,15 @@
       </w:r>
       <w:r>
         <w:br/>
-        <w:t xml:space="preserve">    m_pXRSound = XRSound::CreateInstance(this);   // create sound engine instance for this vessel</w:t>
+        <w:t xml:space="preserve">    m_pXRSound = XRSound::</w:t>
+      </w:r>
+      <w:proofErr w:type="spellStart"/>
+      <w:r>
+        <w:t>CreateInstance</w:t>
+      </w:r>
+      <w:proofErr w:type="spellEnd"/>
+      <w:r>
+        <w:t>(this);   // create sound engine instance for this vessel</w:t>
       </w:r>
       <w:r>
         <w:br/>
@@ -4105,7 +4632,15 @@
       </w:r>
       <w:r>
         <w:br/>
-        <w:t xml:space="preserve">    m_pXRSound-&gt;LoadWav(SystemReset, "XRSound\\Default\\System Reset.wav", XRSound::Radio);  // returns false if file not found</w:t>
+        <w:t xml:space="preserve">    m_pXRSound-&gt;LoadWav(</w:t>
+      </w:r>
+      <w:proofErr w:type="spellStart"/>
+      <w:r>
+        <w:t>SystemReset</w:t>
+      </w:r>
+      <w:proofErr w:type="spellEnd"/>
+      <w:r>
+        <w:t>, "XRSound\\Default\\System Reset.wav", XRSound::Radio);  // returns false if file not found</w:t>
       </w:r>
       <w:r>
         <w:br/>
@@ -4117,7 +4652,23 @@
       </w:r>
       <w:r>
         <w:br/>
-        <w:t xml:space="preserve">    m_pXRSound-&gt;SetDefaultSoundEnabled(XRSound::OneHundredKnots, false);   </w:t>
+        <w:t xml:space="preserve">    m_pXRSound-&gt;</w:t>
+      </w:r>
+      <w:proofErr w:type="spellStart"/>
+      <w:r>
+        <w:t>SetDefaultSoundEnabled</w:t>
+      </w:r>
+      <w:proofErr w:type="spellEnd"/>
+      <w:r>
+        <w:t>(XRSound::</w:t>
+      </w:r>
+      <w:proofErr w:type="spellStart"/>
+      <w:r>
+        <w:t>OneHundredKnots</w:t>
+      </w:r>
+      <w:proofErr w:type="spellEnd"/>
+      <w:r>
+        <w:t xml:space="preserve">, false);   </w:t>
       </w:r>
       <w:r>
         <w:br/>
@@ -4125,11 +4676,32 @@
       </w:r>
       <w:r>
         <w:br/>
-        <w:t xml:space="preserve">    // replace the default docking voice callout with a custom one that resides in $ORBITER_ROOT\MySoundsFolder</w:t>
-      </w:r>
+        <w:t xml:space="preserve">    // replace the default docking voice callout with a custom one that resides in $ORBITER_ROOT\</w:t>
+      </w:r>
+      <w:proofErr w:type="spellStart"/>
+      <w:r>
+        <w:t>MySoundsFolder</w:t>
+      </w:r>
+      <w:proofErr w:type="spellEnd"/>
       <w:r>
         <w:br/>
-        <w:t xml:space="preserve">    m_pXRSound-&gt;LoadWav(XRSound::DockingCallout, "MySoundsFolder\\My custom docking callout.mp3", XRSound::Radio);</w:t>
+        <w:t xml:space="preserve">    m_pXRSound-&gt;LoadWav(XRSound::</w:t>
+      </w:r>
+      <w:proofErr w:type="spellStart"/>
+      <w:r>
+        <w:t>DockingCallout</w:t>
+      </w:r>
+      <w:proofErr w:type="spellEnd"/>
+      <w:r>
+        <w:t>, "</w:t>
+      </w:r>
+      <w:proofErr w:type="spellStart"/>
+      <w:r>
+        <w:t>MySoundsFolder</w:t>
+      </w:r>
+      <w:proofErr w:type="spellEnd"/>
+      <w:r>
+        <w:t>\\My custom docking callout.mp3", XRSound::Radio);</w:t>
       </w:r>
       <w:r>
         <w:br/>
@@ -4141,7 +4713,31 @@
       </w:r>
       <w:r>
         <w:br/>
-        <w:t>void MyVessel::clbkPreStep(double simt, double simdt, double mjd)</w:t>
+        <w:t xml:space="preserve">void MyVessel::clbkPreStep(double </w:t>
+      </w:r>
+      <w:proofErr w:type="spellStart"/>
+      <w:r>
+        <w:t>simt</w:t>
+      </w:r>
+      <w:proofErr w:type="spellEnd"/>
+      <w:r>
+        <w:t xml:space="preserve">, double </w:t>
+      </w:r>
+      <w:proofErr w:type="spellStart"/>
+      <w:r>
+        <w:t>simdt</w:t>
+      </w:r>
+      <w:proofErr w:type="spellEnd"/>
+      <w:r>
+        <w:t xml:space="preserve">, double </w:t>
+      </w:r>
+      <w:proofErr w:type="spellStart"/>
+      <w:r>
+        <w:t>mjd</w:t>
+      </w:r>
+      <w:proofErr w:type="spellEnd"/>
+      <w:r>
+        <w:t>)</w:t>
       </w:r>
       <w:r>
         <w:br/>
@@ -4149,7 +4745,15 @@
       </w:r>
       <w:r>
         <w:br/>
-        <w:t xml:space="preserve">    if (m_bResettingTheSystem)</w:t>
+        <w:t xml:space="preserve">    if (</w:t>
+      </w:r>
+      <w:proofErr w:type="spellStart"/>
+      <w:r>
+        <w:t>m_bResettingTheSystem</w:t>
+      </w:r>
+      <w:proofErr w:type="spellEnd"/>
+      <w:r>
+        <w:t>)</w:t>
       </w:r>
       <w:r>
         <w:br/>
@@ -4161,11 +4765,47 @@
       </w:r>
       <w:r>
         <w:br/>
-        <w:t xml:space="preserve">        m_pXRSound-&gt;PlayWav(SystemReset, false, 1.0);   // returns false if play fails</w:t>
+        <w:t xml:space="preserve">        m_pXRSound-&gt;</w:t>
+      </w:r>
+      <w:proofErr w:type="spellStart"/>
+      <w:r>
+        <w:t>PlayWav</w:t>
+      </w:r>
+      <w:proofErr w:type="spellEnd"/>
+      <w:r>
+        <w:t>(</w:t>
+      </w:r>
+      <w:proofErr w:type="spellStart"/>
+      <w:r>
+        <w:t>SystemReset</w:t>
+      </w:r>
+      <w:proofErr w:type="spellEnd"/>
+      <w:r>
+        <w:t xml:space="preserve">, false, 1.0);   // </w:t>
+      </w:r>
+      <w:r>
+        <w:lastRenderedPageBreak/>
+        <w:t>returns false if play fails</w:t>
       </w:r>
       <w:r>
         <w:br/>
-        <w:t xml:space="preserve">        m_bResettingTheSystem = false;  // so we don't keep looping it (although calling PlayWav if the sound is </w:t>
+        <w:t xml:space="preserve">        </w:t>
+      </w:r>
+      <w:proofErr w:type="spellStart"/>
+      <w:r>
+        <w:t>m_bResettingTheSystem</w:t>
+      </w:r>
+      <w:proofErr w:type="spellEnd"/>
+      <w:r>
+        <w:t xml:space="preserve"> = false;  // so we don't keep looping it (although calling </w:t>
+      </w:r>
+      <w:proofErr w:type="spellStart"/>
+      <w:r>
+        <w:t>PlayWav</w:t>
+      </w:r>
+      <w:proofErr w:type="spellEnd"/>
+      <w:r>
+        <w:t xml:space="preserve"> if the sound is </w:t>
       </w:r>
       <w:r>
         <w:rPr>
@@ -4233,11 +4873,55 @@
         <w:pStyle w:val="Courier10pt"/>
       </w:pPr>
       <w:r>
-        <w:t>if (m_pXRSound-&gt;LoadWav(SystemReset, "My new sound.ogg", XRSound::Radio))   // does sound file exist?</w:t>
+        <w:t>if (m_pXRSound-&gt;</w:t>
+      </w:r>
+      <w:proofErr w:type="gramStart"/>
+      <w:r>
+        <w:t>LoadWav(</w:t>
+      </w:r>
+      <w:proofErr w:type="spellStart"/>
+      <w:proofErr w:type="gramEnd"/>
+      <w:r>
+        <w:t>SystemReset</w:t>
+      </w:r>
+      <w:proofErr w:type="spellEnd"/>
+      <w:r>
+        <w:t>, "My new sound.ogg", XRSound::Radio</w:t>
+      </w:r>
+      <w:proofErr w:type="gramStart"/>
+      <w:r>
+        <w:t xml:space="preserve">))   </w:t>
+      </w:r>
+      <w:proofErr w:type="gramEnd"/>
+      <w:r>
+        <w:t>// does sound file exist?</w:t>
       </w:r>
       <w:r>
         <w:br/>
-        <w:t xml:space="preserve">    m_pXRSound-&gt;PlayWav(SystemReset);    // play the sound using defaults of loop = false and max volume</w:t>
+        <w:t xml:space="preserve">    m_pXRSound-&gt;</w:t>
+      </w:r>
+      <w:proofErr w:type="spellStart"/>
+      <w:proofErr w:type="gramStart"/>
+      <w:r>
+        <w:t>PlayWav</w:t>
+      </w:r>
+      <w:proofErr w:type="spellEnd"/>
+      <w:r>
+        <w:t>(</w:t>
+      </w:r>
+      <w:proofErr w:type="spellStart"/>
+      <w:proofErr w:type="gramEnd"/>
+      <w:r>
+        <w:t>SystemReset</w:t>
+      </w:r>
+      <w:proofErr w:type="spellEnd"/>
+      <w:proofErr w:type="gramStart"/>
+      <w:r>
+        <w:t xml:space="preserve">);   </w:t>
+      </w:r>
+      <w:proofErr w:type="gramEnd"/>
+      <w:r>
+        <w:t xml:space="preserve"> // play the sound using defaults of loop = false and max volume</w:t>
       </w:r>
     </w:p>
     <w:p/>
@@ -4289,9 +4973,11 @@
     </w:p>
     <w:p>
       <w:r>
+        <w:lastRenderedPageBreak/>
         <w:t xml:space="preserve">Sound data is only loaded when it is played: XRSound streams each sound from its file rather than loading the whole file into memory, and releases it automatically when it is no longer needed.  This is managed by the </w:t>
       </w:r>
-      <w:hyperlink r:id="rId32" w:history="1">
+      <w:hyperlink r:id="rId30" w:history="1">
+        <w:proofErr w:type="spellStart"/>
         <w:r>
           <w:rPr>
             <w:rStyle w:val="Hyperlink"/>
@@ -4300,6 +4986,7 @@
           </w:rPr>
           <w:t>miniaudio</w:t>
         </w:r>
+        <w:proofErr w:type="spellEnd"/>
       </w:hyperlink>
       <w:r>
         <w:t xml:space="preserve"> library.</w:t>
@@ -4378,7 +5065,53 @@
           <w:szCs w:val="20"/>
           <w:lang w:eastAsia="ja-JP"/>
         </w:rPr>
-        <w:t>XRSound::CreateInstance(const char *pUniqueModuleName)</w:t>
+        <w:t>XRSound::</w:t>
+      </w:r>
+      <w:proofErr w:type="spellStart"/>
+      <w:proofErr w:type="gramStart"/>
+      <w:r>
+        <w:rPr>
+          <w:rFonts w:ascii="Courier New" w:hAnsi="Courier New" w:cs="Courier New"/>
+          <w:szCs w:val="20"/>
+          <w:lang w:eastAsia="ja-JP"/>
+        </w:rPr>
+        <w:t>CreateInstance</w:t>
+      </w:r>
+      <w:proofErr w:type="spellEnd"/>
+      <w:r>
+        <w:rPr>
+          <w:rFonts w:ascii="Courier New" w:hAnsi="Courier New" w:cs="Courier New"/>
+          <w:szCs w:val="20"/>
+          <w:lang w:eastAsia="ja-JP"/>
+        </w:rPr>
+        <w:t>(</w:t>
+      </w:r>
+      <w:proofErr w:type="gramEnd"/>
+      <w:r>
+        <w:rPr>
+          <w:rFonts w:ascii="Courier New" w:hAnsi="Courier New" w:cs="Courier New"/>
+          <w:szCs w:val="20"/>
+          <w:lang w:eastAsia="ja-JP"/>
+        </w:rPr>
+        <w:t>const char *</w:t>
+      </w:r>
+      <w:proofErr w:type="spellStart"/>
+      <w:r>
+        <w:rPr>
+          <w:rFonts w:ascii="Courier New" w:hAnsi="Courier New" w:cs="Courier New"/>
+          <w:szCs w:val="20"/>
+          <w:lang w:eastAsia="ja-JP"/>
+        </w:rPr>
+        <w:t>pUniqueModuleName</w:t>
+      </w:r>
+      <w:proofErr w:type="spellEnd"/>
+      <w:r>
+        <w:rPr>
+          <w:rFonts w:ascii="Courier New" w:hAnsi="Courier New" w:cs="Courier New"/>
+          <w:szCs w:val="20"/>
+          <w:lang w:eastAsia="ja-JP"/>
+        </w:rPr>
+        <w:t>)</w:t>
       </w:r>
       <w:r>
         <w:rPr>
@@ -4399,12 +5132,14 @@
         </w:rPr>
         <w:t xml:space="preserve"> </w:t>
       </w:r>
+      <w:proofErr w:type="spellStart"/>
       <w:r>
         <w:rPr>
           <w:rStyle w:val="Courier10ptChar"/>
         </w:rPr>
         <w:t>clbkSimulationStart</w:t>
       </w:r>
+      <w:proofErr w:type="spellEnd"/>
       <w:r>
         <w:rPr>
           <w:rFonts w:ascii="Calibri" w:hAnsi="Calibri" w:cs="Calibri"/>
@@ -4463,8 +5198,16 @@
         <w:rPr>
           <w:rStyle w:val="Courier10ptChar"/>
         </w:rPr>
-        <w:t>XRSound::CreateInstance</w:t>
-      </w:r>
+        <w:t>XRSound::</w:t>
+      </w:r>
+      <w:proofErr w:type="spellStart"/>
+      <w:r>
+        <w:rPr>
+          <w:rStyle w:val="Courier10ptChar"/>
+        </w:rPr>
+        <w:t>CreateInstance</w:t>
+      </w:r>
+      <w:proofErr w:type="spellEnd"/>
       <w:r>
         <w:t xml:space="preserve"> from your module’s</w:t>
       </w:r>
@@ -4476,12 +5219,14 @@
         </w:rPr>
         <w:t xml:space="preserve"> </w:t>
       </w:r>
+      <w:proofErr w:type="spellStart"/>
       <w:r>
         <w:rPr>
           <w:rStyle w:val="Courier10ptChar"/>
         </w:rPr>
         <w:t>clbkSimulationStart</w:t>
       </w:r>
+      <w:proofErr w:type="spellEnd"/>
       <w:r>
         <w:rPr>
           <w:rFonts w:ascii="Calibri" w:hAnsi="Calibri" w:cs="Calibri"/>
@@ -4510,12 +5255,14 @@
         </w:rPr>
         <w:t xml:space="preserve"> </w:t>
       </w:r>
+      <w:proofErr w:type="spellStart"/>
       <w:r>
         <w:rPr>
           <w:rStyle w:val="Courier10ptChar"/>
         </w:rPr>
         <w:t>clbkSimulationEnd</w:t>
       </w:r>
+      <w:proofErr w:type="spellEnd"/>
       <w:r>
         <w:t xml:space="preserve"> method.  </w:t>
       </w:r>
@@ -4525,12 +5272,14 @@
         </w:rPr>
         <w:t xml:space="preserve">Note that XRSoundEngine objects are only valid until </w:t>
       </w:r>
+      <w:proofErr w:type="spellStart"/>
       <w:r>
         <w:rPr>
           <w:rStyle w:val="Courier10ptChar"/>
         </w:rPr>
         <w:t>clbkSimulationEnd</w:t>
       </w:r>
+      <w:proofErr w:type="spellEnd"/>
       <w:r>
         <w:rPr>
           <w:u w:val="single"/>
@@ -4568,17 +5317,26 @@
         </w:rPr>
         <w:t xml:space="preserve">Since XRSound uses the </w:t>
       </w:r>
+      <w:proofErr w:type="spellStart"/>
       <w:r>
         <w:rPr>
           <w:rStyle w:val="Courier10ptChar"/>
         </w:rPr>
         <w:t>pUniqueModuleName</w:t>
       </w:r>
+      <w:proofErr w:type="spellEnd"/>
       <w:r>
         <w:rPr>
           <w:lang w:eastAsia="ja-JP"/>
         </w:rPr>
-        <w:t xml:space="preserve"> value to uniquely identify which Orbiter module is calling it, it is best to pass the name of your Orbiter module's DLL here; e.g., if your custom MP3 Orbiter module is installed as </w:t>
+        <w:t xml:space="preserve"> value to uniquely identify which Orbiter module is calling it, it is best to pass the name </w:t>
+      </w:r>
+      <w:r>
+        <w:rPr>
+          <w:lang w:eastAsia="ja-JP"/>
+        </w:rPr>
+        <w:lastRenderedPageBreak/>
+        <w:t xml:space="preserve">of your Orbiter module's DLL here; e.g., if your custom MP3 Orbiter module is installed as </w:t>
       </w:r>
       <w:r>
         <w:rPr>
@@ -4592,18 +5350,21 @@
         </w:rPr>
         <w:t xml:space="preserve">, it's best to pass "MyCoolMp3Player" as the </w:t>
       </w:r>
+      <w:proofErr w:type="spellStart"/>
       <w:r>
         <w:rPr>
           <w:rStyle w:val="Courier10ptChar"/>
         </w:rPr>
         <w:t>pUniqueModuleName</w:t>
       </w:r>
+      <w:proofErr w:type="spellEnd"/>
       <w:r>
         <w:rPr>
           <w:lang w:eastAsia="ja-JP"/>
         </w:rPr>
         <w:t xml:space="preserve"> above. Technically, </w:t>
       </w:r>
+      <w:proofErr w:type="spellStart"/>
       <w:r>
         <w:rPr>
           <w:rFonts w:ascii="Courier New" w:hAnsi="Courier New" w:cs="Courier New"/>
@@ -4612,6 +5373,7 @@
         </w:rPr>
         <w:t>pUniqueModuleName</w:t>
       </w:r>
+      <w:proofErr w:type="spellEnd"/>
       <w:r>
         <w:rPr>
           <w:lang w:eastAsia="ja-JP"/>
@@ -4646,11 +5408,75 @@
         </w:rPr>
         <w:t xml:space="preserve">When calling </w:t>
       </w:r>
+      <w:proofErr w:type="gramStart"/>
       <w:r>
         <w:rPr>
           <w:rStyle w:val="Courier10ptChar"/>
         </w:rPr>
-        <w:t>LoadWav(const int soundID, const char *pSoundFilename, const PlaybackType playbackType)</w:t>
+        <w:t>LoadWav(</w:t>
+      </w:r>
+      <w:proofErr w:type="gramEnd"/>
+      <w:r>
+        <w:rPr>
+          <w:rStyle w:val="Courier10ptChar"/>
+        </w:rPr>
+        <w:t xml:space="preserve">const int </w:t>
+      </w:r>
+      <w:proofErr w:type="spellStart"/>
+      <w:r>
+        <w:rPr>
+          <w:rStyle w:val="Courier10ptChar"/>
+        </w:rPr>
+        <w:t>soundID</w:t>
+      </w:r>
+      <w:proofErr w:type="spellEnd"/>
+      <w:r>
+        <w:rPr>
+          <w:rStyle w:val="Courier10ptChar"/>
+        </w:rPr>
+        <w:t>, const char *</w:t>
+      </w:r>
+      <w:proofErr w:type="spellStart"/>
+      <w:r>
+        <w:rPr>
+          <w:rStyle w:val="Courier10ptChar"/>
+        </w:rPr>
+        <w:t>pSoundFilename</w:t>
+      </w:r>
+      <w:proofErr w:type="spellEnd"/>
+      <w:r>
+        <w:rPr>
+          <w:rStyle w:val="Courier10ptChar"/>
+        </w:rPr>
+        <w:t xml:space="preserve">, const </w:t>
+      </w:r>
+      <w:proofErr w:type="spellStart"/>
+      <w:r>
+        <w:rPr>
+          <w:rStyle w:val="Courier10ptChar"/>
+        </w:rPr>
+        <w:t>PlaybackType</w:t>
+      </w:r>
+      <w:proofErr w:type="spellEnd"/>
+      <w:r>
+        <w:rPr>
+          <w:rStyle w:val="Courier10ptChar"/>
+        </w:rPr>
+        <w:t xml:space="preserve"> </w:t>
+      </w:r>
+      <w:proofErr w:type="spellStart"/>
+      <w:r>
+        <w:rPr>
+          <w:rStyle w:val="Courier10ptChar"/>
+        </w:rPr>
+        <w:t>playbackType</w:t>
+      </w:r>
+      <w:proofErr w:type="spellEnd"/>
+      <w:r>
+        <w:rPr>
+          <w:rStyle w:val="Courier10ptChar"/>
+        </w:rPr>
+        <w:t>)</w:t>
       </w:r>
       <w:r>
         <w:rPr>
@@ -4663,19 +5489,43 @@
           <w:rStyle w:val="Courier10ptChar"/>
           <w:lang w:eastAsia="ja-JP"/>
         </w:rPr>
-        <w:t>XRSound::PlaybackType::Global</w:t>
-      </w:r>
-      <w:r>
-        <w:rPr>
+        <w:t>XRSound::</w:t>
+      </w:r>
+      <w:proofErr w:type="spellStart"/>
+      <w:r>
+        <w:rPr>
+          <w:rStyle w:val="Courier10ptChar"/>
           <w:lang w:eastAsia="ja-JP"/>
         </w:rPr>
+        <w:t>PlaybackType</w:t>
+      </w:r>
+      <w:proofErr w:type="spellEnd"/>
+      <w:r>
+        <w:rPr>
+          <w:rStyle w:val="Courier10ptChar"/>
+          <w:lang w:eastAsia="ja-JP"/>
+        </w:rPr>
+        <w:t>::Global</w:t>
+      </w:r>
+      <w:r>
+        <w:rPr>
+          <w:lang w:eastAsia="ja-JP"/>
+        </w:rPr>
         <w:t xml:space="preserve"> for </w:t>
       </w:r>
+      <w:proofErr w:type="spellStart"/>
       <w:r>
         <w:rPr>
           <w:rStyle w:val="Courier10ptChar"/>
         </w:rPr>
-        <w:t>playbackType,</w:t>
+        <w:t>playbackType</w:t>
+      </w:r>
+      <w:proofErr w:type="spellEnd"/>
+      <w:r>
+        <w:rPr>
+          <w:rStyle w:val="Courier10ptChar"/>
+        </w:rPr>
+        <w:t>,</w:t>
       </w:r>
       <w:r>
         <w:rPr>
@@ -4714,7 +5564,53 @@
           <w:szCs w:val="20"/>
           <w:lang w:eastAsia="ja-JP"/>
         </w:rPr>
-        <w:t>XRSound::CreateInstance(const char *pUniqueModuleName)</w:t>
+        <w:t>XRSound::</w:t>
+      </w:r>
+      <w:proofErr w:type="spellStart"/>
+      <w:proofErr w:type="gramStart"/>
+      <w:r>
+        <w:rPr>
+          <w:rFonts w:ascii="Courier New" w:hAnsi="Courier New" w:cs="Courier New"/>
+          <w:szCs w:val="20"/>
+          <w:lang w:eastAsia="ja-JP"/>
+        </w:rPr>
+        <w:t>CreateInstance</w:t>
+      </w:r>
+      <w:proofErr w:type="spellEnd"/>
+      <w:r>
+        <w:rPr>
+          <w:rFonts w:ascii="Courier New" w:hAnsi="Courier New" w:cs="Courier New"/>
+          <w:szCs w:val="20"/>
+          <w:lang w:eastAsia="ja-JP"/>
+        </w:rPr>
+        <w:t>(</w:t>
+      </w:r>
+      <w:proofErr w:type="gramEnd"/>
+      <w:r>
+        <w:rPr>
+          <w:rFonts w:ascii="Courier New" w:hAnsi="Courier New" w:cs="Courier New"/>
+          <w:szCs w:val="20"/>
+          <w:lang w:eastAsia="ja-JP"/>
+        </w:rPr>
+        <w:t>const char *</w:t>
+      </w:r>
+      <w:proofErr w:type="spellStart"/>
+      <w:r>
+        <w:rPr>
+          <w:rFonts w:ascii="Courier New" w:hAnsi="Courier New" w:cs="Courier New"/>
+          <w:szCs w:val="20"/>
+          <w:lang w:eastAsia="ja-JP"/>
+        </w:rPr>
+        <w:t>pUniqueModuleName</w:t>
+      </w:r>
+      <w:proofErr w:type="spellEnd"/>
+      <w:r>
+        <w:rPr>
+          <w:rFonts w:ascii="Courier New" w:hAnsi="Courier New" w:cs="Courier New"/>
+          <w:szCs w:val="20"/>
+          <w:lang w:eastAsia="ja-JP"/>
+        </w:rPr>
+        <w:t>)</w:t>
       </w:r>
       <w:r>
         <w:rPr>
@@ -4733,12 +5629,14 @@
           <w:lang w:eastAsia="ja-JP"/>
         </w:rPr>
       </w:pPr>
+      <w:proofErr w:type="spellStart"/>
       <w:r>
         <w:rPr>
           <w:rStyle w:val="Courier10ptChar"/>
         </w:rPr>
         <w:t>SetDefaultSoundEnabled</w:t>
       </w:r>
+      <w:proofErr w:type="spellEnd"/>
       <w:r>
         <w:rPr>
           <w:lang w:eastAsia="ja-JP"/>
@@ -4768,12 +5666,14 @@
           <w:lang w:eastAsia="ja-JP"/>
         </w:rPr>
       </w:pPr>
+      <w:proofErr w:type="spellStart"/>
       <w:r>
         <w:rPr>
           <w:rStyle w:val="Courier10ptChar"/>
         </w:rPr>
         <w:t>GetDefaultSoundEnabled</w:t>
       </w:r>
+      <w:proofErr w:type="spellEnd"/>
       <w:r>
         <w:rPr>
           <w:lang w:eastAsia="ja-JP"/>
@@ -4803,12 +5703,14 @@
           <w:lang w:eastAsia="ja-JP"/>
         </w:rPr>
       </w:pPr>
+      <w:proofErr w:type="spellStart"/>
       <w:r>
         <w:rPr>
           <w:rStyle w:val="Courier10ptChar"/>
         </w:rPr>
         <w:t>SetDefaultSoundGroupFolder</w:t>
       </w:r>
+      <w:proofErr w:type="spellEnd"/>
       <w:r>
         <w:rPr>
           <w:lang w:eastAsia="ja-JP"/>
@@ -4838,24 +5740,28 @@
           <w:lang w:eastAsia="ja-JP"/>
         </w:rPr>
       </w:pPr>
+      <w:proofErr w:type="spellStart"/>
       <w:r>
         <w:rPr>
           <w:rStyle w:val="Courier10ptChar"/>
         </w:rPr>
         <w:t>GetDefaultSoundGroupFolder</w:t>
       </w:r>
+      <w:proofErr w:type="spellEnd"/>
       <w:r>
         <w:rPr>
           <w:lang w:eastAsia="ja-JP"/>
         </w:rPr>
         <w:t xml:space="preserve"> always returns </w:t>
       </w:r>
+      <w:proofErr w:type="spellStart"/>
       <w:r>
         <w:rPr>
           <w:rStyle w:val="Courier10ptChar"/>
         </w:rPr>
         <w:t>nullptr</w:t>
       </w:r>
+      <w:proofErr w:type="spellEnd"/>
       <w:r>
         <w:rPr>
           <w:lang w:eastAsia="ja-JP"/>
@@ -4902,7 +5808,7 @@
       <w:r>
         <w:t xml:space="preserve"> for more information about the XRSound SDK.  For questions or support regarding XRSound, visit </w:t>
       </w:r>
-      <w:hyperlink r:id="rId33" w:history="1">
+      <w:hyperlink r:id="rId31" w:history="1">
         <w:r>
           <w:rPr>
             <w:rStyle w:val="Hyperlink"/>
@@ -4922,23 +5828,26 @@
         <w:rPr>
           <w:b/>
         </w:rPr>
+        <w:lastRenderedPageBreak/>
         <w:t>Audio debug window (developers)</w:t>
       </w:r>
     </w:p>
     <w:p>
-      <w:pPr>
-        <w:jc w:val="both"/>
-      </w:pPr>
       <w:r>
         <w:t>Debug builds of XRSound 4.0 add an Audio debug window that lists each active sound, whether it is playing, paused, or stopped, whether it loops, and its file name.  Open it from Orbiter's Custom Functions list (Ctrl+F4) by selecting Audio debug.</w:t>
       </w:r>
     </w:p>
     <w:p>
-      <w:pPr>
-        <w:jc w:val="both"/>
-      </w:pPr>
-      <w:r>
-        <w:t xml:space="preserve">The window uses Orbiter's ImGui dialogs, which Orbiter added after the Orbiter 2024 release, so a Debug </w:t>
+      <w:r>
+        <w:t xml:space="preserve">The window uses Orbiter's </w:t>
+      </w:r>
+      <w:proofErr w:type="spellStart"/>
+      <w:r>
+        <w:t>ImGui</w:t>
+      </w:r>
+      <w:proofErr w:type="spellEnd"/>
+      <w:r>
+        <w:t xml:space="preserve"> dialogs, which Orbiter added after the Orbiter 2024 release, so a Debug </w:t>
       </w:r>
       <w:r>
         <w:rPr>
@@ -4947,7 +5856,15 @@
         <w:t>XRSound.dll</w:t>
       </w:r>
       <w:r>
-        <w:t xml:space="preserve"> that includes the window does not load in Orbiter 2024.  To build a Debug XRSound for Orbiter 2024, configure CMake with </w:t>
+        <w:t xml:space="preserve"> that includes the window does not load in Orbiter 2024.  To build a Debug XRSound for Orbiter 2024, configure </w:t>
+      </w:r>
+      <w:proofErr w:type="spellStart"/>
+      <w:r>
+        <w:t>CMake</w:t>
+      </w:r>
+      <w:proofErr w:type="spellEnd"/>
+      <w:r>
+        <w:t xml:space="preserve"> with </w:t>
       </w:r>
       <w:r>
         <w:rPr>
@@ -4968,8 +5885,8 @@
     </w:p>
     <w:p/>
     <w:sectPr>
-      <w:footerReference w:type="even" r:id="rId34"/>
-      <w:footerReference w:type="default" r:id="rId35"/>
+      <w:footerReference w:type="even" r:id="rId32"/>
+      <w:footerReference w:type="default" r:id="rId33"/>
       <w:pgSz w:w="12240" w:h="15840" w:code="1"/>
       <w:pgMar w:top="1440" w:right="1800" w:bottom="1440" w:left="1800" w:header="720" w:footer="720" w:gutter="0"/>
       <w:cols w:space="720"/>

</xml_diff>

<commit_message>
XRSound 4.1: per-instance volume and settings API
- Runtime SetVolume/GetVolume and SetSetting/GetSetting for each vessel or module;
  configured defaults are read-only
- Per-animation Volume config key; Shuttle-A aux pods play at 0.3
- Lua bindings for the 4.1 API
- Config parser tests that need no audio device
- Fix wheel sounds with a runtime gear ID, stale [SYSTEM] values on re-parse,
  a sticky parse-failure flag, and NaN/infinite volumes
- User manual and ReadMe for 4.1
- Copyright headers in the XRSound source now read "Douglas Beachy and contributors"

Co-Authored-By: Claude Fable 5.1 <noreply@anthropic.com>
</commit_message>
<xml_diff>
--- a/Sound/XRSound/assets/Doc/XRSound User Manual.docx
+++ b/Sound/XRSound/assets/Doc/XRSound User Manual.docx
@@ -40,7 +40,7 @@
           <w:sz w:val="28"/>
           <w:szCs w:val="28"/>
         </w:rPr>
-        <w:t>Version 4.0</w:t>
+        <w:t>Version 4.1</w:t>
       </w:r>
     </w:p>
     <w:p>
@@ -74,7 +74,21 @@
           <w:i/>
           <w:sz w:val="24"/>
         </w:rPr>
-        <w:t>Publication Date: 26-Oct-2026</w:t>
+        <w:t xml:space="preserve">Publication Date: </w:t>
+      </w:r>
+      <w:r>
+        <w:rPr>
+          <w:i/>
+          <w:sz w:val="24"/>
+        </w:rPr>
+        <w:t>30</w:t>
+      </w:r>
+      <w:r>
+        <w:rPr>
+          <w:i/>
+          <w:sz w:val="24"/>
+        </w:rPr>
+        <w:t>-Oct-2026</w:t>
       </w:r>
     </w:p>
     <w:p/>
@@ -312,7 +326,7 @@
         </w:rPr>
         <w:fldChar w:fldCharType="separate"/>
       </w:r>
-      <w:hyperlink w:anchor="_Toc243946899" w:history="1">
+      <w:hyperlink w:anchor="_Toc244109705" w:history="1">
         <w:r>
           <w:rPr>
             <w:rStyle w:val="Hyperlink"/>
@@ -339,7 +353,7 @@
             <w:noProof/>
             <w:webHidden/>
           </w:rPr>
-          <w:instrText xml:space="preserve"> PAGEREF _Toc243946899 \h </w:instrText>
+          <w:instrText xml:space="preserve"> PAGEREF _Toc244109705 \h </w:instrText>
         </w:r>
         <w:r>
           <w:rPr>
@@ -380,7 +394,7 @@
           <w:sz w:val="24"/>
         </w:rPr>
       </w:pPr>
-      <w:hyperlink w:anchor="_Toc243946900" w:history="1">
+      <w:hyperlink w:anchor="_Toc244109706" w:history="1">
         <w:r>
           <w:rPr>
             <w:rStyle w:val="Hyperlink"/>
@@ -407,7 +421,7 @@
             <w:noProof/>
             <w:webHidden/>
           </w:rPr>
-          <w:instrText xml:space="preserve"> PAGEREF _Toc243946900 \h </w:instrText>
+          <w:instrText xml:space="preserve"> PAGEREF _Toc244109706 \h </w:instrText>
         </w:r>
         <w:r>
           <w:rPr>
@@ -448,7 +462,7 @@
           <w:sz w:val="24"/>
         </w:rPr>
       </w:pPr>
-      <w:hyperlink w:anchor="_Toc243946901" w:history="1">
+      <w:hyperlink w:anchor="_Toc244109707" w:history="1">
         <w:r>
           <w:rPr>
             <w:rStyle w:val="Hyperlink"/>
@@ -475,7 +489,7 @@
             <w:noProof/>
             <w:webHidden/>
           </w:rPr>
-          <w:instrText xml:space="preserve"> PAGEREF _Toc243946901 \h </w:instrText>
+          <w:instrText xml:space="preserve"> PAGEREF _Toc244109707 \h </w:instrText>
         </w:r>
         <w:r>
           <w:rPr>
@@ -516,7 +530,7 @@
           <w:sz w:val="24"/>
         </w:rPr>
       </w:pPr>
-      <w:hyperlink w:anchor="_Toc243946902" w:history="1">
+      <w:hyperlink w:anchor="_Toc244109708" w:history="1">
         <w:r>
           <w:rPr>
             <w:rStyle w:val="Hyperlink"/>
@@ -543,7 +557,7 @@
             <w:noProof/>
             <w:webHidden/>
           </w:rPr>
-          <w:instrText xml:space="preserve"> PAGEREF _Toc243946902 \h </w:instrText>
+          <w:instrText xml:space="preserve"> PAGEREF _Toc244109708 \h </w:instrText>
         </w:r>
         <w:r>
           <w:rPr>
@@ -584,7 +598,7 @@
           <w:sz w:val="24"/>
         </w:rPr>
       </w:pPr>
-      <w:hyperlink w:anchor="_Toc243946903" w:history="1">
+      <w:hyperlink w:anchor="_Toc244109709" w:history="1">
         <w:r>
           <w:rPr>
             <w:rStyle w:val="Hyperlink"/>
@@ -611,7 +625,7 @@
             <w:noProof/>
             <w:webHidden/>
           </w:rPr>
-          <w:instrText xml:space="preserve"> PAGEREF _Toc243946903 \h </w:instrText>
+          <w:instrText xml:space="preserve"> PAGEREF _Toc244109709 \h </w:instrText>
         </w:r>
         <w:r>
           <w:rPr>
@@ -631,7 +645,7 @@
             <w:noProof/>
             <w:webHidden/>
           </w:rPr>
-          <w:t>9</w:t>
+          <w:t>10</w:t>
         </w:r>
         <w:r>
           <w:rPr>
@@ -652,7 +666,7 @@
           <w:sz w:val="24"/>
         </w:rPr>
       </w:pPr>
-      <w:hyperlink w:anchor="_Toc243946904" w:history="1">
+      <w:hyperlink w:anchor="_Toc244109710" w:history="1">
         <w:r>
           <w:rPr>
             <w:rStyle w:val="Hyperlink"/>
@@ -679,7 +693,7 @@
             <w:noProof/>
             <w:webHidden/>
           </w:rPr>
-          <w:instrText xml:space="preserve"> PAGEREF _Toc243946904 \h </w:instrText>
+          <w:instrText xml:space="preserve"> PAGEREF _Toc244109710 \h </w:instrText>
         </w:r>
         <w:r>
           <w:rPr>
@@ -720,7 +734,7 @@
           <w:sz w:val="24"/>
         </w:rPr>
       </w:pPr>
-      <w:hyperlink w:anchor="_Toc243946905" w:history="1">
+      <w:hyperlink w:anchor="_Toc244109711" w:history="1">
         <w:r>
           <w:rPr>
             <w:rStyle w:val="Hyperlink"/>
@@ -747,7 +761,7 @@
             <w:noProof/>
             <w:webHidden/>
           </w:rPr>
-          <w:instrText xml:space="preserve"> PAGEREF _Toc243946905 \h </w:instrText>
+          <w:instrText xml:space="preserve"> PAGEREF _Toc244109711 \h </w:instrText>
         </w:r>
         <w:r>
           <w:rPr>
@@ -788,7 +802,7 @@
           <w:sz w:val="24"/>
         </w:rPr>
       </w:pPr>
-      <w:hyperlink w:anchor="_Toc243946906" w:history="1">
+      <w:hyperlink w:anchor="_Toc244109712" w:history="1">
         <w:r>
           <w:rPr>
             <w:rStyle w:val="Hyperlink"/>
@@ -815,7 +829,7 @@
             <w:noProof/>
             <w:webHidden/>
           </w:rPr>
-          <w:instrText xml:space="preserve"> PAGEREF _Toc243946906 \h </w:instrText>
+          <w:instrText xml:space="preserve"> PAGEREF _Toc244109712 \h </w:instrText>
         </w:r>
         <w:r>
           <w:rPr>
@@ -835,7 +849,7 @@
             <w:noProof/>
             <w:webHidden/>
           </w:rPr>
-          <w:t>13</w:t>
+          <w:t>14</w:t>
         </w:r>
         <w:r>
           <w:rPr>
@@ -856,13 +870,13 @@
           <w:sz w:val="24"/>
         </w:rPr>
       </w:pPr>
-      <w:hyperlink w:anchor="_Toc243946907" w:history="1">
+      <w:hyperlink w:anchor="_Toc244109713" w:history="1">
         <w:r>
           <w:rPr>
             <w:rStyle w:val="Hyperlink"/>
             <w:noProof/>
           </w:rPr>
-          <w:t>Using the XRSound C++ APIs to Add Sounds to a Module</w:t>
+          <w:t>Changing Volume Levels and Settings at Runtime</w:t>
         </w:r>
         <w:r>
           <w:rPr>
@@ -883,7 +897,7 @@
             <w:noProof/>
             <w:webHidden/>
           </w:rPr>
-          <w:instrText xml:space="preserve"> PAGEREF _Toc243946907 \h </w:instrText>
+          <w:instrText xml:space="preserve"> PAGEREF _Toc244109713 \h </w:instrText>
         </w:r>
         <w:r>
           <w:rPr>
@@ -916,6 +930,74 @@
     </w:p>
     <w:p>
       <w:pPr>
+        <w:pStyle w:val="TOC1"/>
+        <w:rPr>
+          <w:rFonts w:ascii="Calibri" w:eastAsia="Yu Mincho" w:hAnsi="Calibri"/>
+          <w:noProof/>
+          <w:kern w:val="2"/>
+          <w:sz w:val="24"/>
+        </w:rPr>
+      </w:pPr>
+      <w:hyperlink w:anchor="_Toc244109714" w:history="1">
+        <w:r>
+          <w:rPr>
+            <w:rStyle w:val="Hyperlink"/>
+            <w:noProof/>
+          </w:rPr>
+          <w:t>Using the XRSound C++ APIs to Add Sounds to a Module</w:t>
+        </w:r>
+        <w:r>
+          <w:rPr>
+            <w:noProof/>
+            <w:webHidden/>
+          </w:rPr>
+          <w:tab/>
+        </w:r>
+        <w:r>
+          <w:rPr>
+            <w:noProof/>
+            <w:webHidden/>
+          </w:rPr>
+          <w:fldChar w:fldCharType="begin"/>
+        </w:r>
+        <w:r>
+          <w:rPr>
+            <w:noProof/>
+            <w:webHidden/>
+          </w:rPr>
+          <w:instrText xml:space="preserve"> PAGEREF _Toc244109714 \h </w:instrText>
+        </w:r>
+        <w:r>
+          <w:rPr>
+            <w:noProof/>
+            <w:webHidden/>
+          </w:rPr>
+        </w:r>
+        <w:r>
+          <w:rPr>
+            <w:noProof/>
+            <w:webHidden/>
+          </w:rPr>
+          <w:fldChar w:fldCharType="separate"/>
+        </w:r>
+        <w:r>
+          <w:rPr>
+            <w:noProof/>
+            <w:webHidden/>
+          </w:rPr>
+          <w:t>20</w:t>
+        </w:r>
+        <w:r>
+          <w:rPr>
+            <w:noProof/>
+            <w:webHidden/>
+          </w:rPr>
+          <w:fldChar w:fldCharType="end"/>
+        </w:r>
+      </w:hyperlink>
+    </w:p>
+    <w:p>
+      <w:pPr>
         <w:rPr>
           <w:szCs w:val="22"/>
         </w:rPr>
@@ -992,7 +1074,7 @@
       <w:r>
         <w:br w:type="page"/>
       </w:r>
-      <w:bookmarkStart w:id="0" w:name="_Toc243946899"/>
+      <w:bookmarkStart w:id="0" w:name="_Toc244109705"/>
       <w:r>
         <w:lastRenderedPageBreak/>
         <w:t>Copyright</w:t>
@@ -1235,7 +1317,7 @@
           <w:lang w:eastAsia="ja-JP"/>
         </w:rPr>
         <w:lastRenderedPageBreak/>
-        <w:t xml:space="preserve">XRSound 4.0 includes the </w:t>
+        <w:t xml:space="preserve">XRSound includes the </w:t>
       </w:r>
       <w:proofErr w:type="spellStart"/>
       <w:r>
@@ -1277,13 +1359,19 @@
         <w:rPr>
           <w:lang w:eastAsia="ja-JP"/>
         </w:rPr>
-        <w:t xml:space="preserve"> decoder by Sean Barrett. Each is offered under a choice of public domain or a permissive license (MIT No Attribution for </w:t>
-      </w:r>
-      <w:proofErr w:type="spellStart"/>
+        <w:t xml:space="preserve"> decoder by Sean Barrett.</w:t>
+      </w:r>
       <w:r>
         <w:rPr>
           <w:lang w:eastAsia="ja-JP"/>
         </w:rPr>
+        <w:t xml:space="preserve"> Each is offered under a choice of public domain or a permissive license (MIT No Attribution for </w:t>
+      </w:r>
+      <w:proofErr w:type="spellStart"/>
+      <w:r>
+        <w:rPr>
+          <w:lang w:eastAsia="ja-JP"/>
+        </w:rPr>
         <w:t>miniaudio</w:t>
       </w:r>
       <w:proofErr w:type="spellEnd"/>
@@ -1341,7 +1429,7 @@
       <w:pPr>
         <w:pStyle w:val="Heading1"/>
       </w:pPr>
-      <w:bookmarkStart w:id="1" w:name="_Toc243946900"/>
+      <w:bookmarkStart w:id="1" w:name="_Toc244109706"/>
       <w:r>
         <w:t>Summary</w:t>
       </w:r>
@@ -1421,16 +1509,28 @@
     <w:p/>
     <w:p>
       <w:r>
+        <w:t>XRSound 4.0 replace</w:t>
+      </w:r>
+      <w:r>
+        <w:t>d</w:t>
+      </w:r>
+      <w:r>
+        <w:t xml:space="preserve"> the irrKlang sound engine with the open-source </w:t>
+      </w:r>
+      <w:proofErr w:type="spellStart"/>
+      <w:r>
+        <w:t>miniaudio</w:t>
+      </w:r>
+      <w:proofErr w:type="spellEnd"/>
+      <w:r>
+        <w:t xml:space="preserve"> library; thanks to Gondos for this work. XRSound no longer needs irrKlang.dll or the ikpMP3.dll and ikpFlac.dll plugins.</w:t>
+      </w:r>
+    </w:p>
+    <w:p/>
+    <w:p>
+      <w:r>
         <w:lastRenderedPageBreak/>
-        <w:t xml:space="preserve">XRSound 4.0 replaces the irrKlang sound engine with the open-source </w:t>
-      </w:r>
-      <w:proofErr w:type="spellStart"/>
-      <w:r>
-        <w:t>miniaudio</w:t>
-      </w:r>
-      <w:proofErr w:type="spellEnd"/>
-      <w:r>
-        <w:t xml:space="preserve"> library; thanks to Gondos for this work. XRSound no longer needs irrKlang.dll or the ikpMP3.dll and ikpFlac.dll plugins.</w:t>
+        <w:t>Each vessel or module can change its own volume levels and settings while the simulation runs.</w:t>
       </w:r>
     </w:p>
     <w:p/>
@@ -1438,7 +1538,7 @@
       <w:pPr>
         <w:pStyle w:val="Heading1"/>
       </w:pPr>
-      <w:bookmarkStart w:id="2" w:name="_Toc243946901"/>
+      <w:bookmarkStart w:id="2" w:name="_Toc244109707"/>
       <w:r>
         <w:t>XRSound Features</w:t>
       </w:r>
@@ -1551,7 +1651,13 @@
         </w:numPr>
       </w:pPr>
       <w:r>
-        <w:t>XRSound 4.0 is backwards-compatible with all existing XRSound-enabled vessels; i.e., XRSound 4.0 works with XRSound 1.x-, XRSound 2.x-, and XRSound 3.x-enabled Orbiter add-ons.</w:t>
+        <w:t xml:space="preserve">Each new release of </w:t>
+      </w:r>
+      <w:r>
+        <w:t>XRSound is backwards-compatible with all existing XRSound-enabled vessels</w:t>
+      </w:r>
+      <w:r>
+        <w:t>.</w:t>
       </w:r>
     </w:p>
     <w:p>
@@ -1720,7 +1826,6 @@
           <w:rFonts w:cs="Calibri"/>
           <w:szCs w:val="20"/>
         </w:rPr>
-        <w:lastRenderedPageBreak/>
         <w:t xml:space="preserve">Includes new </w:t>
       </w:r>
       <w:r>
@@ -1766,7 +1871,15 @@
           <w:rFonts w:cs="Calibri"/>
           <w:szCs w:val="20"/>
         </w:rPr>
-        <w:t xml:space="preserve">" on Orbiter-Forum) that plays in external views in space by default. This is configurable like any other sound. (For a lossless version of </w:t>
+        <w:t xml:space="preserve">" on Orbiter-Forum) that plays in </w:t>
+      </w:r>
+      <w:r>
+        <w:rPr>
+          <w:rFonts w:cs="Calibri"/>
+          <w:szCs w:val="20"/>
+        </w:rPr>
+        <w:lastRenderedPageBreak/>
+        <w:t xml:space="preserve">external views in space by default. This is configurable like any other sound. (For a lossless version of </w:t>
       </w:r>
       <w:proofErr w:type="spellStart"/>
       <w:r>
@@ -2288,7 +2401,6 @@
           <w:rFonts w:cs="Calibri"/>
           <w:szCs w:val="20"/>
         </w:rPr>
-        <w:lastRenderedPageBreak/>
         <w:t>Takeoff and landing voice callouts ("100 knots", "Wheels up" / "Liftoff", "You are cleared to land", "Warning: gear is up", "Touchdown", "Wheel stop", etc.)</w:t>
       </w:r>
     </w:p>
@@ -2310,6 +2422,7 @@
           <w:rFonts w:cs="Calibri"/>
           <w:szCs w:val="20"/>
         </w:rPr>
+        <w:lastRenderedPageBreak/>
         <w:t>Wind sound and plasma sound in flight; volume varies by dynamic pressure and distance</w:t>
       </w:r>
     </w:p>
@@ -2597,7 +2710,6 @@
           <w:rFonts w:cs="Calibri"/>
           <w:szCs w:val="20"/>
         </w:rPr>
-        <w:lastRenderedPageBreak/>
         <w:t xml:space="preserve">Can add sound events to any existing Orbiter vessel's animations simply by editing that vessel's class's </w:t>
       </w:r>
       <w:r>
@@ -2690,10 +2802,6 @@
       <w:pPr>
         <w:ind w:left="540"/>
         <w:textAlignment w:val="center"/>
-        <w:rPr>
-          <w:rFonts w:cs="Calibri"/>
-          <w:szCs w:val="20"/>
-        </w:rPr>
       </w:pPr>
     </w:p>
     <w:p>
@@ -2703,30 +2811,9 @@
           <w:numId w:val="39"/>
         </w:numPr>
         <w:textAlignment w:val="center"/>
-        <w:rPr>
-          <w:rFonts w:cs="Calibri"/>
-          <w:szCs w:val="20"/>
-        </w:rPr>
-      </w:pPr>
-      <w:r>
-        <w:rPr>
-          <w:rFonts w:cs="Calibri"/>
-          <w:szCs w:val="20"/>
-        </w:rPr>
-        <w:t xml:space="preserve">Users can replace or disable any or all of the default sounds via the XRSound SDK or </w:t>
-      </w:r>
-      <w:r>
-        <w:rPr>
-          <w:rStyle w:val="Courier10ptChar"/>
-        </w:rPr>
-        <w:t>XRSound.cfg</w:t>
-      </w:r>
-      <w:r>
-        <w:rPr>
-          <w:rFonts w:cs="Calibri"/>
-          <w:szCs w:val="20"/>
-        </w:rPr>
-        <w:t>.</w:t>
+      </w:pPr>
+      <w:r>
+        <w:t>Vessels and modules can change their own main volume, the volume of each type of sound, the volume of each individual sound, and most XRSound.cfg settings at runtime via the XRSound SDK, without affecting any other vessel or module.</w:t>
       </w:r>
     </w:p>
     <w:p>
@@ -2756,7 +2843,20 @@
           <w:rFonts w:cs="Calibri"/>
           <w:szCs w:val="20"/>
         </w:rPr>
-        <w:t>Orbiter add-ons that link with XRSound.lib can still load and run (without sounds, of course) even if the user does not have XRSound installed.</w:t>
+        <w:t xml:space="preserve">Users can replace or disable any or all of the default sounds via the XRSound SDK or </w:t>
+      </w:r>
+      <w:r>
+        <w:rPr>
+          <w:rStyle w:val="Courier10ptChar"/>
+        </w:rPr>
+        <w:t>XRSound.cfg</w:t>
+      </w:r>
+      <w:r>
+        <w:rPr>
+          <w:rFonts w:cs="Calibri"/>
+          <w:szCs w:val="20"/>
+        </w:rPr>
+        <w:t>.</w:t>
       </w:r>
     </w:p>
     <w:p>
@@ -2786,7 +2886,7 @@
           <w:rFonts w:cs="Calibri"/>
           <w:szCs w:val="20"/>
         </w:rPr>
-        <w:t>No limit to the number of sound slots that vessels may use.</w:t>
+        <w:t>Orbiter add-ons that link with XRSound.lib can still load and run (without sounds, of course) even if the user does not have XRSound installed.</w:t>
       </w:r>
     </w:p>
     <w:p>
@@ -2816,11 +2916,12 @@
           <w:rFonts w:cs="Calibri"/>
           <w:szCs w:val="20"/>
         </w:rPr>
-        <w:t>No limit to the number of vessels or modules in the simulation (beyond available physical memory, of course).</w:t>
-      </w:r>
-    </w:p>
-    <w:p>
-      <w:pPr>
+        <w:t>No limit to the number of sound slots that vessels may use.</w:t>
+      </w:r>
+    </w:p>
+    <w:p>
+      <w:pPr>
+        <w:ind w:left="540"/>
         <w:textAlignment w:val="center"/>
         <w:rPr>
           <w:rFonts w:cs="Calibri"/>
@@ -2845,25 +2946,12 @@
           <w:rFonts w:cs="Calibri"/>
           <w:szCs w:val="20"/>
         </w:rPr>
-        <w:t xml:space="preserve">No limit to the number of ATC radio chatter files for a given "radio frequency" (i.e., folder): just configure the ATC folder via your </w:t>
-      </w:r>
-      <w:r>
-        <w:rPr>
-          <w:rStyle w:val="Courier10ptChar"/>
-        </w:rPr>
-        <w:t>XRSound.cfg</w:t>
-      </w:r>
-      <w:r>
-        <w:rPr>
-          <w:rFonts w:cs="Calibri"/>
-          <w:szCs w:val="20"/>
-        </w:rPr>
-        <w:t xml:space="preserve"> file, and all sound files in that folder are played at random for ATC chatter.</w:t>
-      </w:r>
-    </w:p>
-    <w:p>
-      <w:pPr>
-        <w:pStyle w:val="ListParagraph"/>
+        <w:t>No limit to the number of vessels or modules in the simulation (beyond available physical memory, of course).</w:t>
+      </w:r>
+    </w:p>
+    <w:p>
+      <w:pPr>
+        <w:textAlignment w:val="center"/>
         <w:rPr>
           <w:rFonts w:cs="Calibri"/>
           <w:szCs w:val="20"/>
@@ -2887,12 +2975,25 @@
           <w:rFonts w:cs="Calibri"/>
           <w:szCs w:val="20"/>
         </w:rPr>
-        <w:t>No limit to the number of music files in the configured music folder.</w:t>
-      </w:r>
-    </w:p>
-    <w:p>
-      <w:pPr>
-        <w:textAlignment w:val="center"/>
+        <w:t xml:space="preserve">No limit to the number of ATC radio chatter files for a given "radio frequency" (i.e., folder): just configure the ATC folder via your </w:t>
+      </w:r>
+      <w:r>
+        <w:rPr>
+          <w:rStyle w:val="Courier10ptChar"/>
+        </w:rPr>
+        <w:t>XRSound.cfg</w:t>
+      </w:r>
+      <w:r>
+        <w:rPr>
+          <w:rFonts w:cs="Calibri"/>
+          <w:szCs w:val="20"/>
+        </w:rPr>
+        <w:t xml:space="preserve"> file, and all sound files in that folder are played at random for ATC chatter.</w:t>
+      </w:r>
+    </w:p>
+    <w:p>
+      <w:pPr>
+        <w:pStyle w:val="ListParagraph"/>
         <w:rPr>
           <w:rFonts w:cs="Calibri"/>
           <w:szCs w:val="20"/>
@@ -2916,20 +3017,7 @@
           <w:rFonts w:cs="Calibri"/>
           <w:szCs w:val="20"/>
         </w:rPr>
-        <w:t xml:space="preserve">Parameters for minimum and maximum times between ATC chatter playback are configurable via </w:t>
-      </w:r>
-      <w:r>
-        <w:rPr>
-          <w:rStyle w:val="Courier10ptChar"/>
-        </w:rPr>
-        <w:t>XRSound.cfg</w:t>
-      </w:r>
-      <w:r>
-        <w:rPr>
-          <w:rFonts w:cs="Calibri"/>
-          <w:szCs w:val="20"/>
-        </w:rPr>
-        <w:t>.</w:t>
+        <w:t>No limit to the number of music files in the configured music folder.</w:t>
       </w:r>
     </w:p>
     <w:p>
@@ -2958,7 +3046,48 @@
           <w:rFonts w:cs="Calibri"/>
           <w:szCs w:val="20"/>
         </w:rPr>
-        <w:lastRenderedPageBreak/>
+        <w:t xml:space="preserve">Parameters for minimum and maximum times between ATC chatter playback are configurable via </w:t>
+      </w:r>
+      <w:r>
+        <w:rPr>
+          <w:rStyle w:val="Courier10ptChar"/>
+        </w:rPr>
+        <w:t>XRSound.cfg</w:t>
+      </w:r>
+      <w:r>
+        <w:rPr>
+          <w:rFonts w:cs="Calibri"/>
+          <w:szCs w:val="20"/>
+        </w:rPr>
+        <w:t>.</w:t>
+      </w:r>
+    </w:p>
+    <w:p>
+      <w:pPr>
+        <w:textAlignment w:val="center"/>
+        <w:rPr>
+          <w:rFonts w:cs="Calibri"/>
+          <w:szCs w:val="20"/>
+        </w:rPr>
+      </w:pPr>
+    </w:p>
+    <w:p>
+      <w:pPr>
+        <w:numPr>
+          <w:ilvl w:val="0"/>
+          <w:numId w:val="39"/>
+        </w:numPr>
+        <w:textAlignment w:val="center"/>
+        <w:rPr>
+          <w:rFonts w:cs="Calibri"/>
+          <w:szCs w:val="20"/>
+        </w:rPr>
+      </w:pPr>
+      <w:r>
+        <w:rPr>
+          <w:rFonts w:cs="Calibri"/>
+          <w:szCs w:val="20"/>
+        </w:rPr>
         <w:t xml:space="preserve">Uses the </w:t>
       </w:r>
       <w:hyperlink r:id="rId23" w:history="1">
@@ -3230,7 +3359,7 @@
       <w:pPr>
         <w:pStyle w:val="Heading1"/>
       </w:pPr>
-      <w:bookmarkStart w:id="3" w:name="_Toc243946902"/>
+      <w:bookmarkStart w:id="3" w:name="_Toc244109708"/>
       <w:r>
         <w:t>Requirements</w:t>
       </w:r>
@@ -3264,13 +3393,7 @@
         </w:r>
       </w:hyperlink>
       <w:r>
-        <w:t xml:space="preserve"> or newer.  </w:t>
-      </w:r>
-      <w:r>
-        <w:rPr>
-          <w:u w:val="single"/>
-        </w:rPr>
-        <w:t>Older Orbiter releases are not supported by XRSound 4.0.</w:t>
+        <w:t xml:space="preserve"> or newer.</w:t>
       </w:r>
     </w:p>
     <w:p>
@@ -3306,7 +3429,7 @@
       <w:pPr>
         <w:pStyle w:val="Heading1"/>
       </w:pPr>
-      <w:bookmarkStart w:id="4" w:name="_Toc243946903"/>
+      <w:bookmarkStart w:id="4" w:name="_Toc244109709"/>
       <w:r>
         <w:t>Installation</w:t>
       </w:r>
@@ -3368,7 +3491,7 @@
         <w:t>Older versions of Orbiter are not supported</w:t>
       </w:r>
       <w:r>
-        <w:t xml:space="preserve"> by XRSound 4.0.</w:t>
+        <w:t>.</w:t>
       </w:r>
     </w:p>
     <w:p>
@@ -3629,7 +3752,7 @@
           <w:sz w:val="16"/>
         </w:rPr>
       </w:pPr>
-      <w:bookmarkStart w:id="5" w:name="_Toc243946904"/>
+      <w:bookmarkStart w:id="5" w:name="_Toc244109710"/>
       <w:r>
         <w:lastRenderedPageBreak/>
         <w:t>Configuring XRSound</w:t>
@@ -3714,7 +3837,7 @@
       <w:pPr>
         <w:pStyle w:val="Heading1"/>
       </w:pPr>
-      <w:bookmarkStart w:id="6" w:name="_Toc243946905"/>
+      <w:bookmarkStart w:id="6" w:name="_Toc244109711"/>
       <w:r>
         <w:t>Adding Custom Sounds to a Vessel via a Config File</w:t>
       </w:r>
@@ -4238,6 +4361,9 @@
       <w:r>
         <w:t xml:space="preserve"> for details about when each custom animation sound and/or thruster sound plays.</w:t>
       </w:r>
+      <w:r>
+        <w:t xml:space="preserve">  An animation section can also set Volume, from 0 (silent) to 1.0 (full, the default), to play that animation's sounds more quietly; for example, the Shuttle-A's rear thruster pods use Volume = 0.3.</w:t>
+      </w:r>
     </w:p>
     <w:p>
       <w:pPr>
@@ -4339,8 +4465,9 @@
       <w:pPr>
         <w:pStyle w:val="Heading1"/>
       </w:pPr>
-      <w:bookmarkStart w:id="7" w:name="_Toc243946906"/>
-      <w:r>
+      <w:bookmarkStart w:id="7" w:name="_Toc244109712"/>
+      <w:r>
+        <w:lastRenderedPageBreak/>
         <w:t>Using the XRSound C++ APIs to Add Sounds to a Vessel</w:t>
       </w:r>
       <w:bookmarkEnd w:id="7"/>
@@ -4348,7 +4475,6 @@
     <w:p/>
     <w:p>
       <w:r>
-        <w:lastRenderedPageBreak/>
         <w:t xml:space="preserve">XRSound includes a simple, easy-to-use API to play and manipulate sounds from a vessel.  These SDK files are installed to </w:t>
       </w:r>
       <w:r>
@@ -4545,6 +4671,7 @@
         <w:pStyle w:val="Courier10pt"/>
       </w:pPr>
       <w:r>
+        <w:lastRenderedPageBreak/>
         <w:t xml:space="preserve">    …</w:t>
       </w:r>
       <w:r>
@@ -4561,9 +4688,6 @@
       </w:r>
       <w:r>
         <w:br/>
-      </w:r>
-      <w:r>
-        <w:lastRenderedPageBreak/>
         <w:t>{</w:t>
       </w:r>
       <w:r>
@@ -4757,6 +4881,9 @@
       </w:r>
       <w:r>
         <w:br/>
+      </w:r>
+      <w:r>
+        <w:lastRenderedPageBreak/>
         <w:t xml:space="preserve">    {</w:t>
       </w:r>
       <w:r>
@@ -4781,11 +4908,7 @@
       </w:r>
       <w:proofErr w:type="spellEnd"/>
       <w:r>
-        <w:t xml:space="preserve">, false, 1.0);   // </w:t>
-      </w:r>
-      <w:r>
-        <w:lastRenderedPageBreak/>
-        <w:t>returns false if play fails</w:t>
+        <w:t>, false, 1.0);   // returns false if play fails</w:t>
       </w:r>
       <w:r>
         <w:br/>
@@ -4968,12 +5091,12 @@
         </w:numPr>
       </w:pPr>
       <w:r>
+        <w:lastRenderedPageBreak/>
         <w:t xml:space="preserve">saves the file path and playback type in the master sound map in memory for this vessel. </w:t>
       </w:r>
     </w:p>
     <w:p>
       <w:r>
-        <w:lastRenderedPageBreak/>
         <w:t xml:space="preserve">Sound data is only loaded when it is played: XRSound streams each sound from its file rather than loading the whole file into memory, and releases it automatically when it is no longer needed.  This is managed by the </w:t>
       </w:r>
       <w:hyperlink r:id="rId30" w:history="1">
@@ -5007,11 +5130,765 @@
       <w:pPr>
         <w:pStyle w:val="Heading1"/>
       </w:pPr>
-      <w:bookmarkStart w:id="8" w:name="_Toc243946907"/>
+      <w:bookmarkStart w:id="8" w:name="_Toc244109713"/>
+      <w:r>
+        <w:t>Changing Volume Levels and Settings at Runtime</w:t>
+      </w:r>
+      <w:bookmarkEnd w:id="8"/>
+    </w:p>
+    <w:p/>
+    <w:p>
+      <w:r>
+        <w:t>Every vessel and every module has its own volume levels and its own copy of each XRSound setting.</w:t>
+      </w:r>
+      <w:r>
+        <w:t xml:space="preserve"> When your vessel or module creates its XRSound instance, they start at the values configured in XRSound.cfg (and, for a vessel, in its XRSound-&lt;vessel class&gt;.</w:t>
+      </w:r>
+      <w:proofErr w:type="spellStart"/>
+      <w:r>
+        <w:t>cfg</w:t>
+      </w:r>
+      <w:proofErr w:type="spellEnd"/>
+      <w:r>
+        <w:t xml:space="preserve"> file).  Your code can read and change them at any time.  </w:t>
+      </w:r>
+      <w:r>
+        <w:t>A change affects only your own vessel or module: it never changes any XRSound config file or any other vessel or module.</w:t>
+      </w:r>
+    </w:p>
+    <w:p/>
+    <w:p>
+      <w:r>
+        <w:t xml:space="preserve">To read or change a volume level, call </w:t>
+      </w:r>
+      <w:proofErr w:type="spellStart"/>
+      <w:r>
+        <w:rPr>
+          <w:rStyle w:val="Courier10ptChar"/>
+        </w:rPr>
+        <w:t>GetVolume</w:t>
+      </w:r>
+      <w:proofErr w:type="spellEnd"/>
+      <w:r>
+        <w:t xml:space="preserve"> or </w:t>
+      </w:r>
+      <w:proofErr w:type="spellStart"/>
+      <w:r>
+        <w:rPr>
+          <w:rStyle w:val="Courier10ptChar"/>
+        </w:rPr>
+        <w:t>SetVolume</w:t>
+      </w:r>
+      <w:proofErr w:type="spellEnd"/>
+      <w:r>
+        <w:t xml:space="preserve"> with an </w:t>
+      </w:r>
+      <w:r>
+        <w:rPr>
+          <w:rStyle w:val="Courier10ptChar"/>
+        </w:rPr>
+        <w:t>XRSound::</w:t>
+      </w:r>
+      <w:proofErr w:type="spellStart"/>
+      <w:r>
+        <w:rPr>
+          <w:rStyle w:val="Courier10ptChar"/>
+        </w:rPr>
+        <w:t>VolumeType</w:t>
+      </w:r>
+      <w:proofErr w:type="spellEnd"/>
+      <w:r>
+        <w:t xml:space="preserve"> and a level from 0 (muted) to 1.0 (full).  The volume types are:</w:t>
+      </w:r>
+    </w:p>
+    <w:p>
+      <w:pPr>
+        <w:numPr>
+          <w:ilvl w:val="0"/>
+          <w:numId w:val="42"/>
+        </w:numPr>
+      </w:pPr>
+      <w:r>
+        <w:rPr>
+          <w:rStyle w:val="Courier10ptChar"/>
+        </w:rPr>
+        <w:t>Main</w:t>
+      </w:r>
+      <w:r>
+        <w:t xml:space="preserve">: everything this vessel or module plays.  Starts at </w:t>
+      </w:r>
+      <w:proofErr w:type="spellStart"/>
+      <w:r>
+        <w:t>MasterVolume</w:t>
+      </w:r>
+      <w:proofErr w:type="spellEnd"/>
+      <w:r>
+        <w:t xml:space="preserve"> in XRSound.cfg.</w:t>
+      </w:r>
+    </w:p>
+    <w:p>
+      <w:pPr>
+        <w:numPr>
+          <w:ilvl w:val="0"/>
+          <w:numId w:val="42"/>
+        </w:numPr>
+      </w:pPr>
+      <w:r>
+        <w:rPr>
+          <w:rStyle w:val="Courier10ptChar"/>
+        </w:rPr>
+        <w:t>Engines</w:t>
+      </w:r>
+      <w:r>
+        <w:t>: main, retro, hover, and custom engine sounds.</w:t>
+      </w:r>
+    </w:p>
+    <w:p>
+      <w:pPr>
+        <w:numPr>
+          <w:ilvl w:val="0"/>
+          <w:numId w:val="42"/>
+        </w:numPr>
+      </w:pPr>
+      <w:r>
+        <w:rPr>
+          <w:rStyle w:val="Courier10ptChar"/>
+        </w:rPr>
+        <w:t>RCS</w:t>
+      </w:r>
+      <w:r>
+        <w:t>: RCS thruster sounds.</w:t>
+      </w:r>
+    </w:p>
+    <w:p>
+      <w:pPr>
+        <w:numPr>
+          <w:ilvl w:val="0"/>
+          <w:numId w:val="42"/>
+        </w:numPr>
+      </w:pPr>
+      <w:r>
+        <w:rPr>
+          <w:rStyle w:val="Courier10ptChar"/>
+        </w:rPr>
+        <w:t>Effects</w:t>
+      </w:r>
+      <w:r>
+        <w:t>: sound effects such as switches, wind, tires, docking, and crashes, plus the vessel's door and other animation sounds.</w:t>
+      </w:r>
+    </w:p>
+    <w:p>
+      <w:pPr>
+        <w:numPr>
+          <w:ilvl w:val="0"/>
+          <w:numId w:val="42"/>
+        </w:numPr>
+      </w:pPr>
+      <w:r>
+        <w:rPr>
+          <w:rStyle w:val="Courier10ptChar"/>
+        </w:rPr>
+        <w:t>Callouts</w:t>
+      </w:r>
+      <w:r>
+        <w:t>: voice callouts.</w:t>
+      </w:r>
+    </w:p>
+    <w:p>
+      <w:pPr>
+        <w:numPr>
+          <w:ilvl w:val="0"/>
+          <w:numId w:val="42"/>
+        </w:numPr>
+      </w:pPr>
+      <w:proofErr w:type="spellStart"/>
+      <w:r>
+        <w:rPr>
+          <w:rStyle w:val="Courier10ptChar"/>
+        </w:rPr>
+        <w:lastRenderedPageBreak/>
+        <w:t>CabinAmbience</w:t>
+      </w:r>
+      <w:proofErr w:type="spellEnd"/>
+      <w:r>
+        <w:t>: cabin ambience and air conditioning.</w:t>
+      </w:r>
+    </w:p>
+    <w:p>
+      <w:pPr>
+        <w:numPr>
+          <w:ilvl w:val="0"/>
+          <w:numId w:val="42"/>
+        </w:numPr>
+      </w:pPr>
+      <w:r>
+        <w:rPr>
+          <w:rStyle w:val="Courier10ptChar"/>
+        </w:rPr>
+        <w:t>ATC</w:t>
+      </w:r>
+      <w:r>
+        <w:t>: ATC radio chatter.  Starts at ATC Volume in XRSound.cfg.</w:t>
+      </w:r>
+    </w:p>
+    <w:p>
+      <w:pPr>
+        <w:numPr>
+          <w:ilvl w:val="0"/>
+          <w:numId w:val="42"/>
+        </w:numPr>
+      </w:pPr>
+      <w:r>
+        <w:rPr>
+          <w:rStyle w:val="Courier10ptChar"/>
+        </w:rPr>
+        <w:t>Music</w:t>
+      </w:r>
+      <w:r>
+        <w:t xml:space="preserve">: the music level while this vessel has focus.  Starts at </w:t>
+      </w:r>
+      <w:proofErr w:type="spellStart"/>
+      <w:r>
+        <w:t>MusicVolume</w:t>
+      </w:r>
+      <w:proofErr w:type="spellEnd"/>
+      <w:r>
+        <w:t xml:space="preserve"> in XRSound.cfg.</w:t>
+      </w:r>
+    </w:p>
+    <w:p>
+      <w:pPr>
+        <w:numPr>
+          <w:ilvl w:val="0"/>
+          <w:numId w:val="42"/>
+        </w:numPr>
+      </w:pPr>
+      <w:r>
+        <w:rPr>
+          <w:rStyle w:val="Courier10ptChar"/>
+        </w:rPr>
+        <w:t>Custom</w:t>
+      </w:r>
+      <w:r>
+        <w:t>: sounds that your code loads with its own sound IDs.</w:t>
+      </w:r>
+    </w:p>
+    <w:p/>
+    <w:p>
+      <w:r>
+        <w:t>Unless noted above, each level starts at 1.0.</w:t>
+      </w:r>
+      <w:r>
+        <w:t xml:space="preserve">  A sound's final volume is its own volume times the level for its type times the Main level, before XRSound fades it for distance and atmosphere</w:t>
+      </w:r>
+      <w:r>
+        <w:t>.</w:t>
+      </w:r>
+    </w:p>
+    <w:p/>
+    <w:p>
+      <w:r>
+        <w:t xml:space="preserve">You can also set the volume of a single sound with </w:t>
+      </w:r>
+      <w:proofErr w:type="spellStart"/>
+      <w:proofErr w:type="gramStart"/>
+      <w:r>
+        <w:rPr>
+          <w:rStyle w:val="Courier10ptChar"/>
+        </w:rPr>
+        <w:t>SetVolume</w:t>
+      </w:r>
+      <w:proofErr w:type="spellEnd"/>
+      <w:r>
+        <w:rPr>
+          <w:rStyle w:val="Courier10ptChar"/>
+        </w:rPr>
+        <w:t>(</w:t>
+      </w:r>
+      <w:proofErr w:type="spellStart"/>
+      <w:proofErr w:type="gramEnd"/>
+      <w:r>
+        <w:rPr>
+          <w:rStyle w:val="Courier10ptChar"/>
+        </w:rPr>
+        <w:t>soundID</w:t>
+      </w:r>
+      <w:proofErr w:type="spellEnd"/>
+      <w:r>
+        <w:rPr>
+          <w:rStyle w:val="Courier10ptChar"/>
+        </w:rPr>
+        <w:t>, volume)</w:t>
+      </w:r>
+      <w:r>
+        <w:t>.</w:t>
+      </w:r>
+      <w:r>
+        <w:t xml:space="preserve">  For a sound you loaded, this is the volume that </w:t>
+      </w:r>
+      <w:proofErr w:type="spellStart"/>
+      <w:r>
+        <w:rPr>
+          <w:rStyle w:val="Courier10ptChar"/>
+        </w:rPr>
+        <w:t>PlayWav</w:t>
+      </w:r>
+      <w:proofErr w:type="spellEnd"/>
+      <w:r>
+        <w:t xml:space="preserve"> uses when you do not pass one.  </w:t>
+      </w:r>
+      <w:r>
+        <w:t>For a default sound, it scales the volume that XRSound picks for it automatically (for example, by thrust level).</w:t>
+      </w:r>
+    </w:p>
+    <w:p/>
+    <w:p>
+      <w:r>
+        <w:t xml:space="preserve">To read or change a setting, call </w:t>
+      </w:r>
+      <w:proofErr w:type="spellStart"/>
+      <w:r>
+        <w:rPr>
+          <w:rStyle w:val="Courier10ptChar"/>
+        </w:rPr>
+        <w:t>GetSetting</w:t>
+      </w:r>
+      <w:proofErr w:type="spellEnd"/>
+      <w:r>
+        <w:t xml:space="preserve"> or </w:t>
+      </w:r>
+      <w:proofErr w:type="spellStart"/>
+      <w:r>
+        <w:rPr>
+          <w:rStyle w:val="Courier10ptChar"/>
+        </w:rPr>
+        <w:t>SetSetting</w:t>
+      </w:r>
+      <w:proofErr w:type="spellEnd"/>
+      <w:r>
+        <w:t xml:space="preserve"> with an </w:t>
+      </w:r>
+      <w:r>
+        <w:rPr>
+          <w:rStyle w:val="Courier10ptChar"/>
+        </w:rPr>
+        <w:t>XRSound::Setting</w:t>
+      </w:r>
+      <w:r>
+        <w:t xml:space="preserve">.  The settings have the same names and valid values as in XRSound.cfg, such as </w:t>
+      </w:r>
+      <w:proofErr w:type="spellStart"/>
+      <w:r>
+        <w:t>ATCMinDelay</w:t>
+      </w:r>
+      <w:proofErr w:type="spellEnd"/>
+      <w:r>
+        <w:t xml:space="preserve">, </w:t>
+      </w:r>
+      <w:proofErr w:type="spellStart"/>
+      <w:r>
+        <w:t>MusicOrder</w:t>
+      </w:r>
+      <w:proofErr w:type="spellEnd"/>
+      <w:r>
+        <w:t xml:space="preserve">, and </w:t>
+      </w:r>
+      <w:proofErr w:type="spellStart"/>
+      <w:r>
+        <w:t>SilenceOfSpace</w:t>
+      </w:r>
+      <w:proofErr w:type="spellEnd"/>
+      <w:r>
+        <w:t>; see XRSound.h for the full list and when each change takes effect.</w:t>
+      </w:r>
+    </w:p>
+    <w:p/>
+    <w:p>
+      <w:proofErr w:type="spellStart"/>
+      <w:r>
+        <w:rPr>
+          <w:rStyle w:val="Courier10ptChar"/>
+        </w:rPr>
+        <w:t>GetDefaultVolume</w:t>
+      </w:r>
+      <w:proofErr w:type="spellEnd"/>
+      <w:r>
+        <w:t xml:space="preserve"> and </w:t>
+      </w:r>
+      <w:proofErr w:type="spellStart"/>
+      <w:r>
+        <w:rPr>
+          <w:rStyle w:val="Courier10ptChar"/>
+        </w:rPr>
+        <w:t>GetDefaultSetting</w:t>
+      </w:r>
+      <w:proofErr w:type="spellEnd"/>
+      <w:r>
+        <w:t xml:space="preserve"> return the configured starting value for your vessel or module, which never changes during the session.  Use them for things like a "reset to default" button.</w:t>
+      </w:r>
+    </w:p>
+    <w:p/>
+    <w:p>
+      <w:proofErr w:type="spellStart"/>
+      <w:r>
+        <w:rPr>
+          <w:rStyle w:val="Courier10ptChar"/>
+        </w:rPr>
+        <w:t>SetPlaybackType</w:t>
+      </w:r>
+      <w:proofErr w:type="spellEnd"/>
+      <w:r>
+        <w:t xml:space="preserve"> and </w:t>
+      </w:r>
+      <w:proofErr w:type="spellStart"/>
+      <w:r>
+        <w:rPr>
+          <w:rStyle w:val="Courier10ptChar"/>
+        </w:rPr>
+        <w:t>GetPlaybackType</w:t>
+      </w:r>
+      <w:proofErr w:type="spellEnd"/>
+      <w:r>
+        <w:t xml:space="preserve"> change how a single sound is faded, and </w:t>
+      </w:r>
+      <w:proofErr w:type="spellStart"/>
+      <w:r>
+        <w:rPr>
+          <w:rStyle w:val="Courier10ptChar"/>
+        </w:rPr>
+        <w:t>GetDuration</w:t>
+      </w:r>
+      <w:proofErr w:type="spellEnd"/>
+      <w:r>
+        <w:t xml:space="preserve"> gets a sound file's length without playing it.  </w:t>
+      </w:r>
+      <w:proofErr w:type="spellStart"/>
+      <w:r>
+        <w:rPr>
+          <w:rStyle w:val="Courier10ptChar"/>
+        </w:rPr>
+        <w:t>SetPan</w:t>
+      </w:r>
+      <w:proofErr w:type="spellEnd"/>
+      <w:r>
+        <w:t xml:space="preserve">, </w:t>
+      </w:r>
+      <w:proofErr w:type="spellStart"/>
+      <w:r>
+        <w:rPr>
+          <w:rStyle w:val="Courier10ptChar"/>
+        </w:rPr>
+        <w:t>SetPlaybackSpeed</w:t>
+      </w:r>
+      <w:proofErr w:type="spellEnd"/>
+      <w:r>
+        <w:t xml:space="preserve">, and </w:t>
+      </w:r>
+      <w:proofErr w:type="spellStart"/>
+      <w:r>
+        <w:rPr>
+          <w:rStyle w:val="Courier10ptChar"/>
+        </w:rPr>
+        <w:t>SetPlayPosition</w:t>
+      </w:r>
+      <w:proofErr w:type="spellEnd"/>
+      <w:r>
+        <w:t xml:space="preserve"> also work on a loaded sound before it starts playing: the value is applied the next time </w:t>
+      </w:r>
+      <w:proofErr w:type="spellStart"/>
+      <w:r>
+        <w:rPr>
+          <w:rStyle w:val="Courier10ptChar"/>
+        </w:rPr>
+        <w:t>PlayWav</w:t>
+      </w:r>
+      <w:proofErr w:type="spellEnd"/>
+      <w:r>
+        <w:t xml:space="preserve"> starts it.</w:t>
+      </w:r>
+    </w:p>
+    <w:p/>
+    <w:p>
+      <w:r>
+        <w:lastRenderedPageBreak/>
+        <w:t xml:space="preserve">If the user's XRSound.dll is older than 4.1, </w:t>
+      </w:r>
+      <w:proofErr w:type="spellStart"/>
+      <w:r>
+        <w:rPr>
+          <w:rStyle w:val="Courier10ptChar"/>
+        </w:rPr>
+        <w:t>SetVolume</w:t>
+      </w:r>
+      <w:proofErr w:type="spellEnd"/>
+      <w:r>
+        <w:t xml:space="preserve">, </w:t>
+      </w:r>
+      <w:proofErr w:type="spellStart"/>
+      <w:r>
+        <w:rPr>
+          <w:rStyle w:val="Courier10ptChar"/>
+        </w:rPr>
+        <w:t>GetVolume</w:t>
+      </w:r>
+      <w:proofErr w:type="spellEnd"/>
+      <w:r>
+        <w:t xml:space="preserve">, </w:t>
+      </w:r>
+      <w:proofErr w:type="spellStart"/>
+      <w:r>
+        <w:rPr>
+          <w:rStyle w:val="Courier10ptChar"/>
+        </w:rPr>
+        <w:t>SetSetting</w:t>
+      </w:r>
+      <w:proofErr w:type="spellEnd"/>
+      <w:r>
+        <w:t xml:space="preserve">, </w:t>
+      </w:r>
+      <w:proofErr w:type="spellStart"/>
+      <w:r>
+        <w:rPr>
+          <w:rStyle w:val="Courier10ptChar"/>
+        </w:rPr>
+        <w:t>GetSetting</w:t>
+      </w:r>
+      <w:proofErr w:type="spellEnd"/>
+      <w:r>
+        <w:t xml:space="preserve">, </w:t>
+      </w:r>
+      <w:proofErr w:type="spellStart"/>
+      <w:r>
+        <w:rPr>
+          <w:rStyle w:val="Courier10ptChar"/>
+        </w:rPr>
+        <w:t>GetDefaultVolume</w:t>
+      </w:r>
+      <w:proofErr w:type="spellEnd"/>
+      <w:r>
+        <w:t xml:space="preserve">, </w:t>
+      </w:r>
+      <w:proofErr w:type="spellStart"/>
+      <w:r>
+        <w:rPr>
+          <w:rStyle w:val="Courier10ptChar"/>
+        </w:rPr>
+        <w:t>GetDefaultSetting</w:t>
+      </w:r>
+      <w:proofErr w:type="spellEnd"/>
+      <w:r>
+        <w:t xml:space="preserve">, </w:t>
+      </w:r>
+      <w:proofErr w:type="spellStart"/>
+      <w:r>
+        <w:rPr>
+          <w:rStyle w:val="Courier10ptChar"/>
+        </w:rPr>
+        <w:t>SetPlaybackType</w:t>
+      </w:r>
+      <w:proofErr w:type="spellEnd"/>
+      <w:r>
+        <w:t xml:space="preserve">, </w:t>
+      </w:r>
+      <w:proofErr w:type="spellStart"/>
+      <w:r>
+        <w:rPr>
+          <w:rStyle w:val="Courier10ptChar"/>
+        </w:rPr>
+        <w:t>GetPlaybackType</w:t>
+      </w:r>
+      <w:proofErr w:type="spellEnd"/>
+      <w:r>
+        <w:t xml:space="preserve">, and </w:t>
+      </w:r>
+      <w:proofErr w:type="spellStart"/>
+      <w:r>
+        <w:rPr>
+          <w:rStyle w:val="Courier10ptChar"/>
+        </w:rPr>
+        <w:t>GetDuration</w:t>
+      </w:r>
+      <w:proofErr w:type="spellEnd"/>
+      <w:r>
+        <w:t xml:space="preserve"> return false, so your add-on still loads and runs with older XRSound versions.</w:t>
+      </w:r>
+    </w:p>
+    <w:p/>
+    <w:p>
+      <w:r>
+        <w:t>Here is an example:</w:t>
+      </w:r>
+    </w:p>
+    <w:p/>
+    <w:p>
+      <w:pPr>
+        <w:pStyle w:val="Courier10pt"/>
+      </w:pPr>
+      <w:r>
+        <w:t>// turn this vessel's engine sounds down to half</w:t>
+      </w:r>
+      <w:r>
+        <w:br/>
+        <w:t>m_pXRSound-&gt;</w:t>
+      </w:r>
+      <w:proofErr w:type="spellStart"/>
+      <w:proofErr w:type="gramStart"/>
+      <w:r>
+        <w:t>SetVolume</w:t>
+      </w:r>
+      <w:proofErr w:type="spellEnd"/>
+      <w:r>
+        <w:t>(</w:t>
+      </w:r>
+      <w:proofErr w:type="gramEnd"/>
+      <w:r>
+        <w:t>XRSound::</w:t>
+      </w:r>
+      <w:proofErr w:type="spellStart"/>
+      <w:r>
+        <w:t>VolumeType</w:t>
+      </w:r>
+      <w:proofErr w:type="spellEnd"/>
+      <w:r>
+        <w:t>::Engines, 0.5f);</w:t>
+      </w:r>
+      <w:r>
+        <w:br/>
+        <w:t xml:space="preserve"> </w:t>
+      </w:r>
+      <w:r>
+        <w:br/>
+        <w:t>// play ATC chatter less often for this vessel only</w:t>
+      </w:r>
+      <w:r>
+        <w:br/>
+        <w:t>m_pXRSound-&gt;</w:t>
+      </w:r>
+      <w:proofErr w:type="spellStart"/>
+      <w:proofErr w:type="gramStart"/>
+      <w:r>
+        <w:t>SetSetting</w:t>
+      </w:r>
+      <w:proofErr w:type="spellEnd"/>
+      <w:r>
+        <w:t>(</w:t>
+      </w:r>
+      <w:proofErr w:type="gramEnd"/>
+      <w:r>
+        <w:t>XRSound::Setting::</w:t>
+      </w:r>
+      <w:proofErr w:type="spellStart"/>
+      <w:r>
+        <w:t>ATCMinDelay</w:t>
+      </w:r>
+      <w:proofErr w:type="spellEnd"/>
+      <w:r>
+        <w:t>, 60);</w:t>
+      </w:r>
+      <w:r>
+        <w:br/>
+        <w:t>m_pXRSound-&gt;</w:t>
+      </w:r>
+      <w:proofErr w:type="spellStart"/>
+      <w:proofErr w:type="gramStart"/>
+      <w:r>
+        <w:t>SetSetting</w:t>
+      </w:r>
+      <w:proofErr w:type="spellEnd"/>
+      <w:r>
+        <w:t>(</w:t>
+      </w:r>
+      <w:proofErr w:type="gramEnd"/>
+      <w:r>
+        <w:t>XRSound::Setting::</w:t>
+      </w:r>
+      <w:proofErr w:type="spellStart"/>
+      <w:r>
+        <w:t>ATCMaxDelay</w:t>
+      </w:r>
+      <w:proofErr w:type="spellEnd"/>
+      <w:r>
+        <w:t>, 300);</w:t>
+      </w:r>
+      <w:r>
+        <w:br/>
+        <w:t xml:space="preserve"> </w:t>
+      </w:r>
+      <w:r>
+        <w:br/>
+        <w:t>// "reset to default" button for this vessel's main volume</w:t>
+      </w:r>
+      <w:r>
+        <w:br/>
+        <w:t>float level;</w:t>
+      </w:r>
+      <w:r>
+        <w:br/>
+        <w:t>if (m_pXRSound-&gt;</w:t>
+      </w:r>
+      <w:proofErr w:type="spellStart"/>
+      <w:proofErr w:type="gramStart"/>
+      <w:r>
+        <w:t>GetDefaultVolume</w:t>
+      </w:r>
+      <w:proofErr w:type="spellEnd"/>
+      <w:r>
+        <w:t>(</w:t>
+      </w:r>
+      <w:proofErr w:type="gramEnd"/>
+      <w:r>
+        <w:t>XRSound::</w:t>
+      </w:r>
+      <w:proofErr w:type="spellStart"/>
+      <w:r>
+        <w:t>VolumeType</w:t>
+      </w:r>
+      <w:proofErr w:type="spellEnd"/>
+      <w:r>
+        <w:t>::Main, level))</w:t>
+      </w:r>
+      <w:r>
+        <w:br/>
+      </w:r>
+      <w:r>
+        <w:t xml:space="preserve">    m_pXRSound-&gt;</w:t>
+      </w:r>
+      <w:proofErr w:type="spellStart"/>
+      <w:proofErr w:type="gramStart"/>
+      <w:r>
+        <w:t>SetVolume</w:t>
+      </w:r>
+      <w:proofErr w:type="spellEnd"/>
+      <w:r>
+        <w:t>(</w:t>
+      </w:r>
+      <w:proofErr w:type="gramEnd"/>
+      <w:r>
+        <w:t>XRSound::</w:t>
+      </w:r>
+      <w:proofErr w:type="spellStart"/>
+      <w:r>
+        <w:t>VolumeType</w:t>
+      </w:r>
+      <w:proofErr w:type="spellEnd"/>
+      <w:r>
+        <w:t>::Main, level);</w:t>
+      </w:r>
+    </w:p>
+    <w:p>
+      <w:r>
+        <w:t> </w:t>
+      </w:r>
+    </w:p>
+    <w:p>
+      <w:pPr>
+        <w:pStyle w:val="Heading1"/>
+      </w:pPr>
+      <w:bookmarkStart w:id="9" w:name="_Toc244109714"/>
       <w:r>
         <w:t>Using the XRSound C++ APIs to Add Sounds to a Module</w:t>
       </w:r>
-      <w:bookmarkEnd w:id="8"/>
+      <w:bookmarkEnd w:id="9"/>
     </w:p>
     <w:p/>
     <w:p>
@@ -5049,6 +5926,7 @@
         </w:rPr>
       </w:pPr>
       <w:r>
+        <w:lastRenderedPageBreak/>
         <w:t>You create an instance of an XRSound object that is tied to an arbitrary ID, rather than an Orbiter VESSEL object, by calling the</w:t>
       </w:r>
       <w:r>
@@ -5329,14 +6207,7 @@
         <w:rPr>
           <w:lang w:eastAsia="ja-JP"/>
         </w:rPr>
-        <w:t xml:space="preserve"> value to uniquely identify which Orbiter module is calling it, it is best to pass the name </w:t>
-      </w:r>
-      <w:r>
-        <w:rPr>
-          <w:lang w:eastAsia="ja-JP"/>
-        </w:rPr>
-        <w:lastRenderedPageBreak/>
-        <w:t xml:space="preserve">of your Orbiter module's DLL here; e.g., if your custom MP3 Orbiter module is installed as </w:t>
+        <w:t xml:space="preserve"> value to uniquely identify which Orbiter module is calling it, it is best to pass the name of your Orbiter module's DLL here; e.g., if your custom MP3 Orbiter module is installed as </w:t>
       </w:r>
       <w:r>
         <w:rPr>
@@ -5634,6 +6505,7 @@
         <w:rPr>
           <w:rStyle w:val="Courier10ptChar"/>
         </w:rPr>
+        <w:lastRenderedPageBreak/>
         <w:t>SetDefaultSoundEnabled</w:t>
       </w:r>
       <w:proofErr w:type="spellEnd"/>
@@ -5767,6 +6639,37 @@
           <w:lang w:eastAsia="ja-JP"/>
         </w:rPr>
         <w:t>.</w:t>
+      </w:r>
+    </w:p>
+    <w:p>
+      <w:pPr>
+        <w:ind w:left="720"/>
+      </w:pPr>
+    </w:p>
+    <w:p>
+      <w:pPr>
+        <w:numPr>
+          <w:ilvl w:val="0"/>
+          <w:numId w:val="42"/>
+        </w:numPr>
+      </w:pPr>
+      <w:r>
+        <w:t>Modules have their own volume levels and settings too (see Changing Volume Levels and Settings at Runtime above).</w:t>
+      </w:r>
+      <w:r>
+        <w:t xml:space="preserve">  </w:t>
+      </w:r>
+      <w:r>
+        <w:t xml:space="preserve">A module can set the </w:t>
+      </w:r>
+      <w:r>
+        <w:rPr>
+          <w:rStyle w:val="Courier10ptChar"/>
+        </w:rPr>
+        <w:t>Music</w:t>
+      </w:r>
+      <w:r>
+        <w:t xml:space="preserve"> level and the vessel-related settings, but they have no effect for a module, because modules do not play music or default sounds.</w:t>
       </w:r>
     </w:p>
     <w:p>
@@ -5828,15 +6731,18 @@
         <w:rPr>
           <w:b/>
         </w:rPr>
-        <w:lastRenderedPageBreak/>
         <w:t>Audio debug window (developers)</w:t>
       </w:r>
     </w:p>
     <w:p>
       <w:r>
-        <w:t>Debug builds of XRSound 4.0 add an Audio debug window that lists each active sound, whether it is playing, paused, or stopped, whether it loops, and its file name.  Open it from Orbiter's Custom Functions list (Ctrl+F4) by selecting Audio debug.</w:t>
-      </w:r>
-    </w:p>
+        <w:t>Debug builds of XRSound include an Audio debug window that lists each active sound, whether it is playing, paused, or stopped, whether it loops, and its file name.</w:t>
+      </w:r>
+      <w:r>
+        <w:t xml:space="preserve">  Open it from Orbiter's Custom Functions list (Ctrl+F4) by selecting Audio debug.</w:t>
+      </w:r>
+    </w:p>
+    <w:p/>
     <w:p>
       <w:r>
         <w:t xml:space="preserve">The window uses Orbiter's </w:t>
@@ -6030,14 +6936,14 @@
         <w:i/>
         <w:szCs w:val="20"/>
       </w:rPr>
-      <w:t>4</w:t>
+      <w:t>4.1</w:t>
     </w:r>
     <w:r>
       <w:rPr>
         <w:i/>
         <w:szCs w:val="20"/>
       </w:rPr>
-      <w:t xml:space="preserve">.0 </w:t>
+      <w:t xml:space="preserve"> </w:t>
     </w:r>
     <w:r>
       <w:rPr>

</xml_diff>